<commit_message>
results and optimization added to thesis
</commit_message>
<xml_diff>
--- a/thesis/CRQEYD Position Based Fluids.docx
+++ b/thesis/CRQEYD Position Based Fluids.docx
@@ -4849,7 +4849,7 @@
           <w:b w:val="0"/>
           <w:noProof/>
           <w:kern w:val="2"/>
-          <w:lang w:val="hu-HU" w:eastAsia="hu-HU"/>
+          <w:lang w:eastAsia="hu-HU"/>
           <w14:ligatures w14:val="standardContextual"/>
         </w:rPr>
       </w:pPr>
@@ -4876,7 +4876,7 @@
             <w:b w:val="0"/>
             <w:noProof/>
             <w:kern w:val="2"/>
-            <w:lang w:val="hu-HU" w:eastAsia="hu-HU"/>
+            <w:lang w:eastAsia="hu-HU"/>
             <w14:ligatures w14:val="standardContextual"/>
           </w:rPr>
           <w:tab/>
@@ -4949,7 +4949,7 @@
           <w:b w:val="0"/>
           <w:noProof/>
           <w:kern w:val="2"/>
-          <w:lang w:val="hu-HU" w:eastAsia="hu-HU"/>
+          <w:lang w:eastAsia="hu-HU"/>
           <w14:ligatures w14:val="standardContextual"/>
         </w:rPr>
       </w:pPr>
@@ -4967,7 +4967,7 @@
             <w:b w:val="0"/>
             <w:noProof/>
             <w:kern w:val="2"/>
-            <w:lang w:val="hu-HU" w:eastAsia="hu-HU"/>
+            <w:lang w:eastAsia="hu-HU"/>
             <w14:ligatures w14:val="standardContextual"/>
           </w:rPr>
           <w:tab/>
@@ -5040,7 +5040,7 @@
           <w:b w:val="0"/>
           <w:noProof/>
           <w:kern w:val="2"/>
-          <w:lang w:val="hu-HU" w:eastAsia="hu-HU"/>
+          <w:lang w:eastAsia="hu-HU"/>
           <w14:ligatures w14:val="standardContextual"/>
         </w:rPr>
       </w:pPr>
@@ -5058,7 +5058,7 @@
             <w:b w:val="0"/>
             <w:noProof/>
             <w:kern w:val="2"/>
-            <w:lang w:val="hu-HU" w:eastAsia="hu-HU"/>
+            <w:lang w:eastAsia="hu-HU"/>
             <w14:ligatures w14:val="standardContextual"/>
           </w:rPr>
           <w:tab/>
@@ -5131,7 +5131,7 @@
           <w:rFonts w:asciiTheme="minorHAnsi" w:eastAsiaTheme="minorEastAsia" w:hAnsiTheme="minorHAnsi" w:cstheme="minorBidi"/>
           <w:noProof/>
           <w:kern w:val="2"/>
-          <w:lang w:val="hu-HU" w:eastAsia="hu-HU"/>
+          <w:lang w:eastAsia="hu-HU"/>
           <w14:ligatures w14:val="standardContextual"/>
         </w:rPr>
       </w:pPr>
@@ -5148,7 +5148,7 @@
             <w:rFonts w:asciiTheme="minorHAnsi" w:eastAsiaTheme="minorEastAsia" w:hAnsiTheme="minorHAnsi" w:cstheme="minorBidi"/>
             <w:noProof/>
             <w:kern w:val="2"/>
-            <w:lang w:val="hu-HU" w:eastAsia="hu-HU"/>
+            <w:lang w:eastAsia="hu-HU"/>
             <w14:ligatures w14:val="standardContextual"/>
           </w:rPr>
           <w:tab/>
@@ -5221,7 +5221,7 @@
           <w:rFonts w:asciiTheme="minorHAnsi" w:eastAsiaTheme="minorEastAsia" w:hAnsiTheme="minorHAnsi" w:cstheme="minorBidi"/>
           <w:noProof/>
           <w:kern w:val="2"/>
-          <w:lang w:val="hu-HU" w:eastAsia="hu-HU"/>
+          <w:lang w:eastAsia="hu-HU"/>
           <w14:ligatures w14:val="standardContextual"/>
         </w:rPr>
       </w:pPr>
@@ -5238,7 +5238,7 @@
             <w:rFonts w:asciiTheme="minorHAnsi" w:eastAsiaTheme="minorEastAsia" w:hAnsiTheme="minorHAnsi" w:cstheme="minorBidi"/>
             <w:noProof/>
             <w:kern w:val="2"/>
-            <w:lang w:val="hu-HU" w:eastAsia="hu-HU"/>
+            <w:lang w:eastAsia="hu-HU"/>
             <w14:ligatures w14:val="standardContextual"/>
           </w:rPr>
           <w:tab/>
@@ -5311,7 +5311,7 @@
           <w:rFonts w:asciiTheme="minorHAnsi" w:eastAsiaTheme="minorEastAsia" w:hAnsiTheme="minorHAnsi" w:cstheme="minorBidi"/>
           <w:noProof/>
           <w:kern w:val="2"/>
-          <w:lang w:val="hu-HU" w:eastAsia="hu-HU"/>
+          <w:lang w:eastAsia="hu-HU"/>
           <w14:ligatures w14:val="standardContextual"/>
         </w:rPr>
       </w:pPr>
@@ -5328,7 +5328,7 @@
             <w:rFonts w:asciiTheme="minorHAnsi" w:eastAsiaTheme="minorEastAsia" w:hAnsiTheme="minorHAnsi" w:cstheme="minorBidi"/>
             <w:noProof/>
             <w:kern w:val="2"/>
-            <w:lang w:val="hu-HU" w:eastAsia="hu-HU"/>
+            <w:lang w:eastAsia="hu-HU"/>
             <w14:ligatures w14:val="standardContextual"/>
           </w:rPr>
           <w:tab/>
@@ -5401,7 +5401,7 @@
           <w:rFonts w:asciiTheme="minorHAnsi" w:eastAsiaTheme="minorEastAsia" w:hAnsiTheme="minorHAnsi" w:cstheme="minorBidi"/>
           <w:noProof/>
           <w:kern w:val="2"/>
-          <w:lang w:val="hu-HU" w:eastAsia="hu-HU"/>
+          <w:lang w:eastAsia="hu-HU"/>
           <w14:ligatures w14:val="standardContextual"/>
         </w:rPr>
       </w:pPr>
@@ -5418,7 +5418,7 @@
             <w:rFonts w:asciiTheme="minorHAnsi" w:eastAsiaTheme="minorEastAsia" w:hAnsiTheme="minorHAnsi" w:cstheme="minorBidi"/>
             <w:noProof/>
             <w:kern w:val="2"/>
-            <w:lang w:val="hu-HU" w:eastAsia="hu-HU"/>
+            <w:lang w:eastAsia="hu-HU"/>
             <w14:ligatures w14:val="standardContextual"/>
           </w:rPr>
           <w:tab/>
@@ -5491,7 +5491,7 @@
           <w:rFonts w:asciiTheme="minorHAnsi" w:eastAsiaTheme="minorEastAsia" w:hAnsiTheme="minorHAnsi" w:cstheme="minorBidi"/>
           <w:noProof/>
           <w:kern w:val="2"/>
-          <w:lang w:val="hu-HU" w:eastAsia="hu-HU"/>
+          <w:lang w:eastAsia="hu-HU"/>
           <w14:ligatures w14:val="standardContextual"/>
         </w:rPr>
       </w:pPr>
@@ -5508,7 +5508,7 @@
             <w:rFonts w:asciiTheme="minorHAnsi" w:eastAsiaTheme="minorEastAsia" w:hAnsiTheme="minorHAnsi" w:cstheme="minorBidi"/>
             <w:noProof/>
             <w:kern w:val="2"/>
-            <w:lang w:val="hu-HU" w:eastAsia="hu-HU"/>
+            <w:lang w:eastAsia="hu-HU"/>
             <w14:ligatures w14:val="standardContextual"/>
           </w:rPr>
           <w:tab/>
@@ -5581,7 +5581,7 @@
           <w:b w:val="0"/>
           <w:noProof/>
           <w:kern w:val="2"/>
-          <w:lang w:val="hu-HU" w:eastAsia="hu-HU"/>
+          <w:lang w:eastAsia="hu-HU"/>
           <w14:ligatures w14:val="standardContextual"/>
         </w:rPr>
       </w:pPr>
@@ -5599,7 +5599,7 @@
             <w:b w:val="0"/>
             <w:noProof/>
             <w:kern w:val="2"/>
-            <w:lang w:val="hu-HU" w:eastAsia="hu-HU"/>
+            <w:lang w:eastAsia="hu-HU"/>
             <w14:ligatures w14:val="standardContextual"/>
           </w:rPr>
           <w:tab/>
@@ -5672,7 +5672,7 @@
           <w:rFonts w:asciiTheme="minorHAnsi" w:eastAsiaTheme="minorEastAsia" w:hAnsiTheme="minorHAnsi" w:cstheme="minorBidi"/>
           <w:noProof/>
           <w:kern w:val="2"/>
-          <w:lang w:val="hu-HU" w:eastAsia="hu-HU"/>
+          <w:lang w:eastAsia="hu-HU"/>
           <w14:ligatures w14:val="standardContextual"/>
         </w:rPr>
       </w:pPr>
@@ -5689,7 +5689,7 @@
             <w:rFonts w:asciiTheme="minorHAnsi" w:eastAsiaTheme="minorEastAsia" w:hAnsiTheme="minorHAnsi" w:cstheme="minorBidi"/>
             <w:noProof/>
             <w:kern w:val="2"/>
-            <w:lang w:val="hu-HU" w:eastAsia="hu-HU"/>
+            <w:lang w:eastAsia="hu-HU"/>
             <w14:ligatures w14:val="standardContextual"/>
           </w:rPr>
           <w:tab/>
@@ -5762,7 +5762,7 @@
           <w:rFonts w:asciiTheme="minorHAnsi" w:eastAsiaTheme="minorEastAsia" w:hAnsiTheme="minorHAnsi" w:cstheme="minorBidi"/>
           <w:noProof/>
           <w:kern w:val="2"/>
-          <w:lang w:val="hu-HU" w:eastAsia="hu-HU"/>
+          <w:lang w:eastAsia="hu-HU"/>
           <w14:ligatures w14:val="standardContextual"/>
         </w:rPr>
       </w:pPr>
@@ -5779,7 +5779,7 @@
             <w:rFonts w:asciiTheme="minorHAnsi" w:eastAsiaTheme="minorEastAsia" w:hAnsiTheme="minorHAnsi" w:cstheme="minorBidi"/>
             <w:noProof/>
             <w:kern w:val="2"/>
-            <w:lang w:val="hu-HU" w:eastAsia="hu-HU"/>
+            <w:lang w:eastAsia="hu-HU"/>
             <w14:ligatures w14:val="standardContextual"/>
           </w:rPr>
           <w:tab/>
@@ -5852,7 +5852,7 @@
           <w:rFonts w:asciiTheme="minorHAnsi" w:eastAsiaTheme="minorEastAsia" w:hAnsiTheme="minorHAnsi" w:cstheme="minorBidi"/>
           <w:noProof/>
           <w:kern w:val="2"/>
-          <w:lang w:val="hu-HU" w:eastAsia="hu-HU"/>
+          <w:lang w:eastAsia="hu-HU"/>
           <w14:ligatures w14:val="standardContextual"/>
         </w:rPr>
       </w:pPr>
@@ -5869,7 +5869,7 @@
             <w:rFonts w:asciiTheme="minorHAnsi" w:eastAsiaTheme="minorEastAsia" w:hAnsiTheme="minorHAnsi" w:cstheme="minorBidi"/>
             <w:noProof/>
             <w:kern w:val="2"/>
-            <w:lang w:val="hu-HU" w:eastAsia="hu-HU"/>
+            <w:lang w:eastAsia="hu-HU"/>
             <w14:ligatures w14:val="standardContextual"/>
           </w:rPr>
           <w:tab/>
@@ -5942,7 +5942,7 @@
           <w:rFonts w:asciiTheme="minorHAnsi" w:eastAsiaTheme="minorEastAsia" w:hAnsiTheme="minorHAnsi" w:cstheme="minorBidi"/>
           <w:noProof/>
           <w:kern w:val="2"/>
-          <w:lang w:val="hu-HU" w:eastAsia="hu-HU"/>
+          <w:lang w:eastAsia="hu-HU"/>
           <w14:ligatures w14:val="standardContextual"/>
         </w:rPr>
       </w:pPr>
@@ -5959,7 +5959,7 @@
             <w:rFonts w:asciiTheme="minorHAnsi" w:eastAsiaTheme="minorEastAsia" w:hAnsiTheme="minorHAnsi" w:cstheme="minorBidi"/>
             <w:noProof/>
             <w:kern w:val="2"/>
-            <w:lang w:val="hu-HU" w:eastAsia="hu-HU"/>
+            <w:lang w:eastAsia="hu-HU"/>
             <w14:ligatures w14:val="standardContextual"/>
           </w:rPr>
           <w:tab/>
@@ -6032,7 +6032,7 @@
           <w:rFonts w:asciiTheme="minorHAnsi" w:eastAsiaTheme="minorEastAsia" w:hAnsiTheme="minorHAnsi" w:cstheme="minorBidi"/>
           <w:noProof/>
           <w:kern w:val="2"/>
-          <w:lang w:val="hu-HU" w:eastAsia="hu-HU"/>
+          <w:lang w:eastAsia="hu-HU"/>
           <w14:ligatures w14:val="standardContextual"/>
         </w:rPr>
       </w:pPr>
@@ -6049,7 +6049,7 @@
             <w:rFonts w:asciiTheme="minorHAnsi" w:eastAsiaTheme="minorEastAsia" w:hAnsiTheme="minorHAnsi" w:cstheme="minorBidi"/>
             <w:noProof/>
             <w:kern w:val="2"/>
-            <w:lang w:val="hu-HU" w:eastAsia="hu-HU"/>
+            <w:lang w:eastAsia="hu-HU"/>
             <w14:ligatures w14:val="standardContextual"/>
           </w:rPr>
           <w:tab/>
@@ -6122,7 +6122,7 @@
           <w:b w:val="0"/>
           <w:noProof/>
           <w:kern w:val="2"/>
-          <w:lang w:val="hu-HU" w:eastAsia="hu-HU"/>
+          <w:lang w:eastAsia="hu-HU"/>
           <w14:ligatures w14:val="standardContextual"/>
         </w:rPr>
       </w:pPr>
@@ -6140,7 +6140,7 @@
             <w:b w:val="0"/>
             <w:noProof/>
             <w:kern w:val="2"/>
-            <w:lang w:val="hu-HU" w:eastAsia="hu-HU"/>
+            <w:lang w:eastAsia="hu-HU"/>
             <w14:ligatures w14:val="standardContextual"/>
           </w:rPr>
           <w:tab/>
@@ -6213,7 +6213,7 @@
           <w:b w:val="0"/>
           <w:noProof/>
           <w:kern w:val="2"/>
-          <w:lang w:val="hu-HU" w:eastAsia="hu-HU"/>
+          <w:lang w:eastAsia="hu-HU"/>
           <w14:ligatures w14:val="standardContextual"/>
         </w:rPr>
       </w:pPr>
@@ -6231,7 +6231,7 @@
             <w:b w:val="0"/>
             <w:noProof/>
             <w:kern w:val="2"/>
-            <w:lang w:val="hu-HU" w:eastAsia="hu-HU"/>
+            <w:lang w:eastAsia="hu-HU"/>
             <w14:ligatures w14:val="standardContextual"/>
           </w:rPr>
           <w:tab/>
@@ -6304,7 +6304,7 @@
           <w:rFonts w:asciiTheme="minorHAnsi" w:eastAsiaTheme="minorEastAsia" w:hAnsiTheme="minorHAnsi" w:cstheme="minorBidi"/>
           <w:noProof/>
           <w:kern w:val="2"/>
-          <w:lang w:val="hu-HU" w:eastAsia="hu-HU"/>
+          <w:lang w:eastAsia="hu-HU"/>
           <w14:ligatures w14:val="standardContextual"/>
         </w:rPr>
       </w:pPr>
@@ -6321,7 +6321,7 @@
             <w:rFonts w:asciiTheme="minorHAnsi" w:eastAsiaTheme="minorEastAsia" w:hAnsiTheme="minorHAnsi" w:cstheme="minorBidi"/>
             <w:noProof/>
             <w:kern w:val="2"/>
-            <w:lang w:val="hu-HU" w:eastAsia="hu-HU"/>
+            <w:lang w:eastAsia="hu-HU"/>
             <w14:ligatures w14:val="standardContextual"/>
           </w:rPr>
           <w:tab/>
@@ -6394,7 +6394,7 @@
           <w:rFonts w:asciiTheme="minorHAnsi" w:eastAsiaTheme="minorEastAsia" w:hAnsiTheme="minorHAnsi" w:cstheme="minorBidi"/>
           <w:noProof/>
           <w:kern w:val="2"/>
-          <w:lang w:val="hu-HU" w:eastAsia="hu-HU"/>
+          <w:lang w:eastAsia="hu-HU"/>
           <w14:ligatures w14:val="standardContextual"/>
         </w:rPr>
       </w:pPr>
@@ -6411,7 +6411,7 @@
             <w:rFonts w:asciiTheme="minorHAnsi" w:eastAsiaTheme="minorEastAsia" w:hAnsiTheme="minorHAnsi" w:cstheme="minorBidi"/>
             <w:noProof/>
             <w:kern w:val="2"/>
-            <w:lang w:val="hu-HU" w:eastAsia="hu-HU"/>
+            <w:lang w:eastAsia="hu-HU"/>
             <w14:ligatures w14:val="standardContextual"/>
           </w:rPr>
           <w:tab/>
@@ -6484,7 +6484,7 @@
           <w:rFonts w:asciiTheme="minorHAnsi" w:eastAsiaTheme="minorEastAsia" w:hAnsiTheme="minorHAnsi" w:cstheme="minorBidi"/>
           <w:noProof/>
           <w:kern w:val="2"/>
-          <w:lang w:val="hu-HU" w:eastAsia="hu-HU"/>
+          <w:lang w:eastAsia="hu-HU"/>
           <w14:ligatures w14:val="standardContextual"/>
         </w:rPr>
       </w:pPr>
@@ -6501,7 +6501,7 @@
             <w:rFonts w:asciiTheme="minorHAnsi" w:eastAsiaTheme="minorEastAsia" w:hAnsiTheme="minorHAnsi" w:cstheme="minorBidi"/>
             <w:noProof/>
             <w:kern w:val="2"/>
-            <w:lang w:val="hu-HU" w:eastAsia="hu-HU"/>
+            <w:lang w:eastAsia="hu-HU"/>
             <w14:ligatures w14:val="standardContextual"/>
           </w:rPr>
           <w:tab/>
@@ -6574,7 +6574,7 @@
           <w:rFonts w:asciiTheme="minorHAnsi" w:eastAsiaTheme="minorEastAsia" w:hAnsiTheme="minorHAnsi" w:cstheme="minorBidi"/>
           <w:noProof/>
           <w:kern w:val="2"/>
-          <w:lang w:val="hu-HU" w:eastAsia="hu-HU"/>
+          <w:lang w:eastAsia="hu-HU"/>
           <w14:ligatures w14:val="standardContextual"/>
         </w:rPr>
       </w:pPr>
@@ -6591,7 +6591,7 @@
             <w:rFonts w:asciiTheme="minorHAnsi" w:eastAsiaTheme="minorEastAsia" w:hAnsiTheme="minorHAnsi" w:cstheme="minorBidi"/>
             <w:noProof/>
             <w:kern w:val="2"/>
-            <w:lang w:val="hu-HU" w:eastAsia="hu-HU"/>
+            <w:lang w:eastAsia="hu-HU"/>
             <w14:ligatures w14:val="standardContextual"/>
           </w:rPr>
           <w:tab/>
@@ -6664,7 +6664,7 @@
           <w:rFonts w:asciiTheme="minorHAnsi" w:eastAsiaTheme="minorEastAsia" w:hAnsiTheme="minorHAnsi" w:cstheme="minorBidi"/>
           <w:noProof/>
           <w:kern w:val="2"/>
-          <w:lang w:val="hu-HU" w:eastAsia="hu-HU"/>
+          <w:lang w:eastAsia="hu-HU"/>
           <w14:ligatures w14:val="standardContextual"/>
         </w:rPr>
       </w:pPr>
@@ -6681,7 +6681,7 @@
             <w:rFonts w:asciiTheme="minorHAnsi" w:eastAsiaTheme="minorEastAsia" w:hAnsiTheme="minorHAnsi" w:cstheme="minorBidi"/>
             <w:noProof/>
             <w:kern w:val="2"/>
-            <w:lang w:val="hu-HU" w:eastAsia="hu-HU"/>
+            <w:lang w:eastAsia="hu-HU"/>
             <w14:ligatures w14:val="standardContextual"/>
           </w:rPr>
           <w:tab/>
@@ -6754,7 +6754,7 @@
           <w:b w:val="0"/>
           <w:noProof/>
           <w:kern w:val="2"/>
-          <w:lang w:val="hu-HU" w:eastAsia="hu-HU"/>
+          <w:lang w:eastAsia="hu-HU"/>
           <w14:ligatures w14:val="standardContextual"/>
         </w:rPr>
       </w:pPr>
@@ -6772,7 +6772,7 @@
             <w:b w:val="0"/>
             <w:noProof/>
             <w:kern w:val="2"/>
-            <w:lang w:val="hu-HU" w:eastAsia="hu-HU"/>
+            <w:lang w:eastAsia="hu-HU"/>
             <w14:ligatures w14:val="standardContextual"/>
           </w:rPr>
           <w:tab/>
@@ -6845,7 +6845,7 @@
           <w:b w:val="0"/>
           <w:noProof/>
           <w:kern w:val="2"/>
-          <w:lang w:val="hu-HU" w:eastAsia="hu-HU"/>
+          <w:lang w:eastAsia="hu-HU"/>
           <w14:ligatures w14:val="standardContextual"/>
         </w:rPr>
       </w:pPr>
@@ -6863,7 +6863,7 @@
             <w:b w:val="0"/>
             <w:noProof/>
             <w:kern w:val="2"/>
-            <w:lang w:val="hu-HU" w:eastAsia="hu-HU"/>
+            <w:lang w:eastAsia="hu-HU"/>
             <w14:ligatures w14:val="standardContextual"/>
           </w:rPr>
           <w:tab/>
@@ -6936,7 +6936,7 @@
           <w:b w:val="0"/>
           <w:noProof/>
           <w:kern w:val="2"/>
-          <w:lang w:val="hu-HU" w:eastAsia="hu-HU"/>
+          <w:lang w:eastAsia="hu-HU"/>
           <w14:ligatures w14:val="standardContextual"/>
         </w:rPr>
       </w:pPr>
@@ -6954,7 +6954,7 @@
             <w:b w:val="0"/>
             <w:noProof/>
             <w:kern w:val="2"/>
-            <w:lang w:val="hu-HU" w:eastAsia="hu-HU"/>
+            <w:lang w:eastAsia="hu-HU"/>
             <w14:ligatures w14:val="standardContextual"/>
           </w:rPr>
           <w:tab/>
@@ -7027,7 +7027,7 @@
           <w:rFonts w:asciiTheme="minorHAnsi" w:eastAsiaTheme="minorEastAsia" w:hAnsiTheme="minorHAnsi" w:cstheme="minorBidi"/>
           <w:noProof/>
           <w:kern w:val="2"/>
-          <w:lang w:val="hu-HU" w:eastAsia="hu-HU"/>
+          <w:lang w:eastAsia="hu-HU"/>
           <w14:ligatures w14:val="standardContextual"/>
         </w:rPr>
       </w:pPr>
@@ -7044,7 +7044,7 @@
             <w:rFonts w:asciiTheme="minorHAnsi" w:eastAsiaTheme="minorEastAsia" w:hAnsiTheme="minorHAnsi" w:cstheme="minorBidi"/>
             <w:noProof/>
             <w:kern w:val="2"/>
-            <w:lang w:val="hu-HU" w:eastAsia="hu-HU"/>
+            <w:lang w:eastAsia="hu-HU"/>
             <w14:ligatures w14:val="standardContextual"/>
           </w:rPr>
           <w:tab/>
@@ -8939,7 +8939,7 @@
           <w:noProof/>
           <w:highlight w:val="yellow"/>
         </w:rPr>
-        <w:t>2026. 05. 15.</w:t>
+        <w:t>2026. 05. 16.</w:t>
       </w:r>
       <w:r>
         <w:rPr>
@@ -9385,10 +9385,7 @@
         <w:fldChar w:fldCharType="end"/>
       </w:r>
       <w:r>
-        <w:t xml:space="preserve">, on which several other methods build such as </w:t>
-      </w:r>
-      <w:r>
-        <w:t>Predictive-Corrective Incompressible SPH</w:t>
+        <w:t>, on which several other methods build such as Predictive-Corrective Incompressible SPH</w:t>
       </w:r>
       <w:r>
         <w:t xml:space="preserve"> </w:t>
@@ -9703,10 +9700,7 @@
         <w:fldChar w:fldCharType="end"/>
       </w:r>
       <w:r>
-        <w:t>, but is expanded upon and reformulated with the goal of providing a more detailed, intuitive mathematical explanation.</w:t>
-      </w:r>
-      <w:r>
-        <w:t xml:space="preserve"> </w:t>
+        <w:t xml:space="preserve">, but is expanded upon and reformulated with the goal of providing a more detailed, intuitive mathematical explanation. </w:t>
       </w:r>
     </w:p>
     <w:p>
@@ -16154,17 +16148,11 @@
         <w:fldChar w:fldCharType="end"/>
       </w:r>
       <w:r>
-        <w:t>, “</w:t>
-      </w:r>
-      <w:r>
-        <w:t xml:space="preserve">Each small piece of vorticity can be thought of as a paddle wheel trying to spin the flow field in a particular direction. Artificial numerical dissipation damps out the effect of these paddle wheels, and the key idea is to simply add it </w:t>
+        <w:t xml:space="preserve">, “Each small piece of vorticity can be thought of as a paddle wheel trying to spin the flow field in a particular direction. Artificial numerical dissipation damps out the effect of these paddle wheels, and the key idea is to simply add it </w:t>
       </w:r>
       <w:proofErr w:type="gramStart"/>
       <w:r>
-        <w:t>back.</w:t>
-      </w:r>
-      <w:r>
-        <w:t>“</w:t>
+        <w:t>back.“</w:t>
       </w:r>
       <w:proofErr w:type="gramEnd"/>
       <w:r>
@@ -19534,14 +19522,7 @@
           <w:b/>
           <w:bCs/>
         </w:rPr>
-        <w:t>Down-sweep (reduce) phase</w:t>
-      </w:r>
-      <w:r>
-        <w:rPr>
-          <w:b/>
-          <w:bCs/>
-        </w:rPr>
-        <w:t>:</w:t>
+        <w:t>Down-sweep (reduce) phase:</w:t>
       </w:r>
       <w:r>
         <w:t xml:space="preserve"> The exclusive prefix sum is produced by traversing the tree back down from the root. First, the root (</w:t>
@@ -20207,10 +20188,7 @@
         <w:t>g</w:t>
       </w:r>
       <w:r>
-        <w:t xml:space="preserve"> </w:t>
-      </w:r>
-      <w:r>
-        <w:t>within its super-group</w:t>
+        <w:t xml:space="preserve"> within its super-group</w:t>
       </w:r>
       <w:r>
         <w:t>, but not yet the global offset from preceding super-groups.</w:t>
@@ -20419,17 +20397,11 @@
       </w:r>
       <w:proofErr w:type="spellStart"/>
       <w:r>
-        <w:t>g</w:t>
-      </w:r>
-      <w:r>
-        <w:t>roupshared</w:t>
-      </w:r>
-      <w:proofErr w:type="spellEnd"/>
-      <w:r>
-        <w:t xml:space="preserve"> memory budget and thread cap per group</w:t>
-      </w:r>
-      <w:r>
-        <w:t>.</w:t>
+        <w:t>groupshared</w:t>
+      </w:r>
+      <w:proofErr w:type="spellEnd"/>
+      <w:r>
+        <w:t xml:space="preserve"> memory budget and thread cap per group.</w:t>
       </w:r>
     </w:p>
     <w:p>
@@ -22261,13 +22233,7 @@
         </w:numPr>
       </w:pPr>
       <w:r>
-        <w:t xml:space="preserve">Depth </w:t>
-      </w:r>
-      <w:r>
-        <w:t>pass for LOD</w:t>
-      </w:r>
-      <w:r>
-        <w:t>: renders scene depth to a depth texture</w:t>
+        <w:t>Depth pass for LOD: renders scene depth to a depth texture</w:t>
       </w:r>
       <w:r>
         <w:t xml:space="preserve">, as discussed in chapter </w:t>
@@ -22326,13 +22292,7 @@
     <w:p>
       <w:r>
         <w:lastRenderedPageBreak/>
-        <w:t xml:space="preserve">The simulation exposes </w:t>
-      </w:r>
-      <w:r>
-        <w:t>several</w:t>
-      </w:r>
-      <w:r>
-        <w:t xml:space="preserve"> </w:t>
+        <w:t xml:space="preserve">The simulation exposes several </w:t>
       </w:r>
       <w:proofErr w:type="spellStart"/>
       <w:r>
@@ -22340,25 +22300,7 @@
       </w:r>
       <w:proofErr w:type="spellEnd"/>
       <w:r>
-        <w:t xml:space="preserve"> parameters</w:t>
-      </w:r>
-      <w:r>
-        <w:t>,</w:t>
-      </w:r>
-      <w:r>
-        <w:t xml:space="preserve"> such as solver iterations, viscosity, vorticity epsilon, and artificial pressure</w:t>
-      </w:r>
-      <w:r>
-        <w:t>.</w:t>
-      </w:r>
-      <w:r>
-        <w:t xml:space="preserve"> </w:t>
-      </w:r>
-      <w:r>
-        <w:t>These</w:t>
-      </w:r>
-      <w:r>
-        <w:t xml:space="preserve"> are controlled at runtime via a graphical user interface built using Dear </w:t>
+        <w:t xml:space="preserve"> parameters, such as solver iterations, viscosity, vorticity epsilon, and artificial pressure. These are controlled at runtime via a graphical user interface built using Dear </w:t>
       </w:r>
       <w:proofErr w:type="spellStart"/>
       <w:r>
@@ -22374,10 +22316,7 @@
       </w:r>
       <w:proofErr w:type="spellEnd"/>
       <w:r>
-        <w:t xml:space="preserve"> is a lightweight GUI library designed for use in real-time applications such as games and simulations</w:t>
-      </w:r>
-      <w:r>
-        <w:t xml:space="preserve"> </w:t>
+        <w:t xml:space="preserve"> is a lightweight GUI library designed for use in real-time applications such as games and simulations </w:t>
       </w:r>
       <w:r>
         <w:fldChar w:fldCharType="begin"/>
@@ -22420,6 +22359,9 @@
         <w:jc w:val="center"/>
       </w:pPr>
       <w:r>
+        <w:rPr>
+          <w:noProof/>
+        </w:rPr>
         <w:drawing>
           <wp:inline distT="0" distB="0" distL="0" distR="0" wp14:anchorId="5D55C68C" wp14:editId="6C843D3D">
             <wp:extent cx="2575020" cy="3017520"/>
@@ -22597,13 +22539,7 @@
           <w:rPr>
             <w:rFonts w:ascii="Cambria Math" w:hAnsi="Cambria Math"/>
           </w:rPr>
-          <m:t>forward=</m:t>
-        </m:r>
-        <m:r>
-          <w:rPr>
-            <w:rFonts w:ascii="Cambria Math" w:hAnsi="Cambria Math"/>
-          </w:rPr>
-          <m:t>cameraPos-center</m:t>
+          <m:t>forward=cameraPos-center</m:t>
         </m:r>
       </m:oMath>
     </w:p>
@@ -22652,25 +22588,7 @@
           <w:rPr>
             <w:rFonts w:ascii="Cambria Math" w:hAnsi="Cambria Math"/>
           </w:rPr>
-          <m:t>right=</m:t>
-        </m:r>
-        <m:r>
-          <w:rPr>
-            <w:rFonts w:ascii="Cambria Math" w:hAnsi="Cambria Math"/>
-          </w:rPr>
-          <m:t>worldUp×forward</m:t>
-        </m:r>
-        <m:r>
-          <w:rPr>
-            <w:rFonts w:ascii="Cambria Math" w:hAnsi="Cambria Math"/>
-          </w:rPr>
-          <m:t>, up=</m:t>
-        </m:r>
-        <m:r>
-          <w:rPr>
-            <w:rFonts w:ascii="Cambria Math" w:hAnsi="Cambria Math"/>
-          </w:rPr>
-          <m:t>forward×right</m:t>
+          <m:t>right=worldUp×forward, up=forward×right</m:t>
         </m:r>
       </m:oMath>
     </w:p>
@@ -22955,19 +22873,7 @@
           <w:rPr>
             <w:rFonts w:ascii="Cambria Math" w:hAnsi="Cambria Math"/>
           </w:rPr>
-          <m:t>n=u*right+v*up+z*forward</m:t>
-        </m:r>
-        <m:r>
-          <w:rPr>
-            <w:rFonts w:ascii="Cambria Math" w:hAnsi="Cambria Math"/>
-          </w:rPr>
-          <m:t xml:space="preserve"> </m:t>
-        </m:r>
-        <m:r>
-          <w:rPr>
-            <w:rFonts w:ascii="Cambria Math" w:hAnsi="Cambria Math"/>
-          </w:rPr>
-          <m:t>.</m:t>
+          <m:t>n=u*right+v*up+z*forward .</m:t>
         </m:r>
       </m:oMath>
     </w:p>
@@ -23156,19 +23062,7 @@
                 <w:rPr>
                   <w:rFonts w:ascii="Cambria Math" w:hAnsi="Cambria Math"/>
                 </w:rPr>
-                <m:t>(</m:t>
-              </m:r>
-              <m:r>
-                <w:rPr>
-                  <w:rFonts w:ascii="Cambria Math" w:hAnsi="Cambria Math"/>
-                </w:rPr>
-                <m:t>x</m:t>
-              </m:r>
-              <m:r>
-                <w:rPr>
-                  <w:rFonts w:ascii="Cambria Math" w:hAnsi="Cambria Math"/>
-                </w:rPr>
-                <m:t>-</m:t>
+                <m:t>(x-</m:t>
               </m:r>
               <m:sSub>
                 <m:sSubPr>
@@ -23241,16 +23135,7 @@
         <w:t xml:space="preserve">concurrent threads will attempt to access the same voxel and increment it at the same time. </w:t>
       </w:r>
       <w:r>
-        <w:t>This must be protected against by a compare-and-swap style atomic addition</w:t>
-      </w:r>
-      <w:r>
-        <w:t>, since</w:t>
-      </w:r>
-      <w:r>
-        <w:t xml:space="preserve"> HLSL does not natively support atomic additions on floating point values</w:t>
-      </w:r>
-      <w:r>
-        <w:t xml:space="preserve"> (such as the density). The computation’s </w:t>
+        <w:t xml:space="preserve">This must be protected against by a compare-and-swap style atomic addition, since HLSL does not natively support atomic additions on floating point values (such as the density). The computation’s </w:t>
       </w:r>
       <w:r>
         <w:lastRenderedPageBreak/>
@@ -23376,19 +23261,7 @@
           <w:rPr>
             <w:rFonts w:ascii="Cambria Math" w:hAnsi="Cambria Math"/>
           </w:rPr>
-          <m:t>(</m:t>
-        </m:r>
-        <m:r>
-          <w:rPr>
-            <w:rFonts w:ascii="Cambria Math" w:hAnsi="Cambria Math"/>
-          </w:rPr>
-          <m:t>x</m:t>
-        </m:r>
-        <m:r>
-          <w:rPr>
-            <w:rFonts w:ascii="Cambria Math" w:hAnsi="Cambria Math"/>
-          </w:rPr>
-          <m:t>-</m:t>
+          <m:t>(x-</m:t>
         </m:r>
         <m:sSub>
           <m:sSubPr>
@@ -23454,22 +23327,7 @@
       </w:pPr>
       <w:bookmarkStart w:id="24" w:name="_Toc229611185"/>
       <w:r>
-        <w:t>The</w:t>
-      </w:r>
-      <w:r>
-        <w:t xml:space="preserve"> vertex shader is fed a full screen </w:t>
-      </w:r>
-      <w:r>
-        <w:t>quad and</w:t>
-      </w:r>
-      <w:r>
-        <w:t xml:space="preserve"> adds a ray direction to </w:t>
-      </w:r>
-      <w:r>
-        <w:t>its output</w:t>
-      </w:r>
-      <w:r>
-        <w:t>.</w:t>
+        <w:t>The vertex shader is fed a full screen quad and adds a ray direction to its output.</w:t>
       </w:r>
     </w:p>
     <w:p>
@@ -23484,13 +23342,7 @@
         <w:t xml:space="preserve">The pixel shader </w:t>
       </w:r>
       <w:r>
-        <w:t xml:space="preserve">implements the ray marching above, shading the pixels in a </w:t>
-      </w:r>
-      <w:r>
-        <w:t>Blinn-Phong</w:t>
-      </w:r>
-      <w:r>
-        <w:t xml:space="preserve"> fashion.</w:t>
+        <w:t>implements the ray marching above, shading the pixels in a Blinn-Phong fashion.</w:t>
       </w:r>
     </w:p>
     <w:p>
@@ -23509,20 +23361,639 @@
         <w:pStyle w:val="Heading1"/>
       </w:pPr>
       <w:r>
-        <w:t>Optimization</w:t>
-      </w:r>
-      <w:bookmarkEnd w:id="24"/>
+        <w:t>Results</w:t>
+      </w:r>
+    </w:p>
+    <w:p>
+      <w:r>
+        <w:t xml:space="preserve">The fluid simulation was tested using two kinds of hardware: </w:t>
+      </w:r>
+      <w:r>
+        <w:t>NVIDIA GeForce RTX 4050 Laptop GPU</w:t>
+      </w:r>
+      <w:r>
+        <w:t xml:space="preserve"> and </w:t>
+      </w:r>
+      <w:r>
+        <w:rPr>
+          <w:highlight w:val="yellow"/>
+        </w:rPr>
+        <w:t xml:space="preserve">NVIDIA GeForce RTX </w:t>
+      </w:r>
+      <w:r>
+        <w:rPr>
+          <w:highlight w:val="yellow"/>
+        </w:rPr>
+        <w:t>3080</w:t>
+      </w:r>
+      <w:r>
+        <w:rPr>
+          <w:highlight w:val="yellow"/>
+        </w:rPr>
+        <w:t xml:space="preserve"> GPU</w:t>
+      </w:r>
+      <w:r>
+        <w:t xml:space="preserve">. </w:t>
+      </w:r>
+      <w:r>
+        <w:t>With a grid of 128</w:t>
+      </w:r>
+      <w:r>
+        <w:rPr>
+          <w:vertAlign w:val="superscript"/>
+        </w:rPr>
+        <w:t>3</w:t>
+      </w:r>
+      <w:r>
+        <w:t>, particle counts in the hundreds of thousands were simulated at 35-50 fps, using the following particle parameters:</w:t>
+      </w:r>
+    </w:p>
+    <w:tbl>
+      <w:tblPr>
+        <w:tblStyle w:val="TableGrid"/>
+        <w:tblW w:w="0" w:type="auto"/>
+        <w:tblLook w:val="04A0" w:firstRow="1" w:lastRow="0" w:firstColumn="1" w:lastColumn="0" w:noHBand="0" w:noVBand="1"/>
+      </w:tblPr>
+      <w:tblGrid>
+        <w:gridCol w:w="1047"/>
+        <w:gridCol w:w="1052"/>
+        <w:gridCol w:w="1058"/>
+        <w:gridCol w:w="1076"/>
+        <w:gridCol w:w="1076"/>
+        <w:gridCol w:w="1076"/>
+        <w:gridCol w:w="1026"/>
+        <w:gridCol w:w="1083"/>
+      </w:tblGrid>
+      <w:tr>
+        <w:tc>
+          <w:tcPr>
+            <w:tcW w:w="1061" w:type="dxa"/>
+          </w:tcPr>
+          <w:p>
+            <w:pPr>
+              <w:ind w:firstLine="0"/>
+              <w:rPr>
+                <w:sz w:val="20"/>
+                <w:szCs w:val="20"/>
+              </w:rPr>
+            </w:pPr>
+            <w:r>
+              <w:rPr>
+                <w:rFonts w:ascii="Times New Roman" w:eastAsia="Times New Roman" w:hAnsi="Times New Roman" w:cs="Times New Roman"/>
+                <w:sz w:val="20"/>
+                <w:szCs w:val="20"/>
+              </w:rPr>
+              <w:t>Max solver iterations</w:t>
+            </w:r>
+          </w:p>
+        </w:tc>
+        <w:tc>
+          <w:tcPr>
+            <w:tcW w:w="1061" w:type="dxa"/>
+          </w:tcPr>
+          <w:p>
+            <w:pPr>
+              <w:ind w:firstLine="0"/>
+              <w:rPr>
+                <w:sz w:val="20"/>
+                <w:szCs w:val="20"/>
+              </w:rPr>
+            </w:pPr>
+            <w:r>
+              <w:rPr>
+                <w:sz w:val="20"/>
+                <w:szCs w:val="20"/>
+              </w:rPr>
+              <w:t>Min solver iterations</w:t>
+            </w:r>
+          </w:p>
+        </w:tc>
+        <w:tc>
+          <w:tcPr>
+            <w:tcW w:w="1062" w:type="dxa"/>
+          </w:tcPr>
+          <w:p>
+            <w:pPr>
+              <w:ind w:firstLine="0"/>
+              <w:rPr>
+                <w:sz w:val="20"/>
+                <w:szCs w:val="20"/>
+              </w:rPr>
+            </w:pPr>
+            <w:r>
+              <w:rPr>
+                <w:rFonts w:cstheme="minorHAnsi"/>
+                <w:sz w:val="20"/>
+                <w:szCs w:val="20"/>
+              </w:rPr>
+              <w:t>ε</w:t>
+            </w:r>
+            <w:r>
+              <w:rPr>
+                <w:sz w:val="20"/>
+                <w:szCs w:val="20"/>
+              </w:rPr>
+              <w:t xml:space="preserve"> relaxation</w:t>
+            </w:r>
+          </w:p>
+        </w:tc>
+        <w:tc>
+          <w:tcPr>
+            <w:tcW w:w="1062" w:type="dxa"/>
+          </w:tcPr>
+          <w:p>
+            <w:pPr>
+              <w:ind w:firstLine="0"/>
+              <w:rPr>
+                <w:sz w:val="20"/>
+                <w:szCs w:val="20"/>
+              </w:rPr>
+            </w:pPr>
+            <w:r>
+              <w:rPr>
+                <w:sz w:val="20"/>
+                <w:szCs w:val="20"/>
+              </w:rPr>
+              <w:t>Viscosity coefficient</w:t>
+            </w:r>
+          </w:p>
+        </w:tc>
+        <w:tc>
+          <w:tcPr>
+            <w:tcW w:w="1062" w:type="dxa"/>
+          </w:tcPr>
+          <w:p>
+            <w:pPr>
+              <w:ind w:firstLine="0"/>
+              <w:rPr>
+                <w:sz w:val="20"/>
+                <w:szCs w:val="20"/>
+              </w:rPr>
+            </w:pPr>
+            <w:r>
+              <w:rPr>
+                <w:sz w:val="20"/>
+                <w:szCs w:val="20"/>
+              </w:rPr>
+              <w:t>Artificial pressure coefficient</w:t>
+            </w:r>
+          </w:p>
+        </w:tc>
+        <w:tc>
+          <w:tcPr>
+            <w:tcW w:w="1062" w:type="dxa"/>
+          </w:tcPr>
+          <w:p>
+            <w:pPr>
+              <w:ind w:firstLine="0"/>
+              <w:rPr>
+                <w:sz w:val="20"/>
+                <w:szCs w:val="20"/>
+              </w:rPr>
+            </w:pPr>
+            <w:r>
+              <w:rPr>
+                <w:sz w:val="20"/>
+                <w:szCs w:val="20"/>
+              </w:rPr>
+              <w:t>Vorticity coefficient</w:t>
+            </w:r>
+          </w:p>
+        </w:tc>
+        <w:tc>
+          <w:tcPr>
+            <w:tcW w:w="1062" w:type="dxa"/>
+          </w:tcPr>
+          <w:p>
+            <w:pPr>
+              <w:ind w:firstLine="0"/>
+              <w:rPr>
+                <w:sz w:val="20"/>
+                <w:szCs w:val="20"/>
+              </w:rPr>
+            </w:pPr>
+            <w:r>
+              <w:rPr>
+                <w:sz w:val="20"/>
+                <w:szCs w:val="20"/>
+              </w:rPr>
+              <w:t xml:space="preserve">Target density </w:t>
+            </w:r>
+          </w:p>
+        </w:tc>
+        <w:tc>
+          <w:tcPr>
+            <w:tcW w:w="1062" w:type="dxa"/>
+          </w:tcPr>
+          <w:p>
+            <w:pPr>
+              <w:ind w:firstLine="0"/>
+              <w:rPr>
+                <w:sz w:val="20"/>
+                <w:szCs w:val="20"/>
+              </w:rPr>
+            </w:pPr>
+            <w:r>
+              <w:rPr>
+                <w:sz w:val="20"/>
+                <w:szCs w:val="20"/>
+              </w:rPr>
+              <w:t>SPH smoothing radius</w:t>
+            </w:r>
+          </w:p>
+        </w:tc>
+      </w:tr>
+      <w:tr>
+        <w:tc>
+          <w:tcPr>
+            <w:tcW w:w="1061" w:type="dxa"/>
+          </w:tcPr>
+          <w:p>
+            <w:pPr>
+              <w:ind w:firstLine="0"/>
+              <w:rPr>
+                <w:sz w:val="20"/>
+                <w:szCs w:val="20"/>
+              </w:rPr>
+            </w:pPr>
+            <w:r>
+              <w:rPr>
+                <w:sz w:val="20"/>
+                <w:szCs w:val="20"/>
+              </w:rPr>
+              <w:lastRenderedPageBreak/>
+              <w:t>6</w:t>
+            </w:r>
+          </w:p>
+        </w:tc>
+        <w:tc>
+          <w:tcPr>
+            <w:tcW w:w="1061" w:type="dxa"/>
+          </w:tcPr>
+          <w:p>
+            <w:pPr>
+              <w:ind w:firstLine="0"/>
+              <w:rPr>
+                <w:sz w:val="20"/>
+                <w:szCs w:val="20"/>
+              </w:rPr>
+            </w:pPr>
+            <w:r>
+              <w:rPr>
+                <w:sz w:val="20"/>
+                <w:szCs w:val="20"/>
+              </w:rPr>
+              <w:t>3</w:t>
+            </w:r>
+          </w:p>
+        </w:tc>
+        <w:tc>
+          <w:tcPr>
+            <w:tcW w:w="1062" w:type="dxa"/>
+          </w:tcPr>
+          <w:p>
+            <w:pPr>
+              <w:ind w:firstLine="0"/>
+              <w:rPr>
+                <w:sz w:val="20"/>
+                <w:szCs w:val="20"/>
+              </w:rPr>
+            </w:pPr>
+            <w:r>
+              <w:rPr>
+                <w:sz w:val="20"/>
+                <w:szCs w:val="20"/>
+              </w:rPr>
+              <w:t>4.0</w:t>
+            </w:r>
+          </w:p>
+        </w:tc>
+        <w:tc>
+          <w:tcPr>
+            <w:tcW w:w="1062" w:type="dxa"/>
+          </w:tcPr>
+          <w:p>
+            <w:pPr>
+              <w:ind w:firstLine="0"/>
+              <w:rPr>
+                <w:sz w:val="20"/>
+                <w:szCs w:val="20"/>
+              </w:rPr>
+            </w:pPr>
+            <w:r>
+              <w:rPr>
+                <w:sz w:val="20"/>
+                <w:szCs w:val="20"/>
+              </w:rPr>
+              <w:t>0.005</w:t>
+            </w:r>
+          </w:p>
+        </w:tc>
+        <w:tc>
+          <w:tcPr>
+            <w:tcW w:w="1062" w:type="dxa"/>
+          </w:tcPr>
+          <w:p>
+            <w:pPr>
+              <w:ind w:firstLine="0"/>
+              <w:rPr>
+                <w:sz w:val="20"/>
+                <w:szCs w:val="20"/>
+              </w:rPr>
+            </w:pPr>
+            <w:r>
+              <w:rPr>
+                <w:sz w:val="20"/>
+                <w:szCs w:val="20"/>
+              </w:rPr>
+              <w:t>0.01</w:t>
+            </w:r>
+            <w:r>
+              <w:rPr>
+                <w:sz w:val="20"/>
+                <w:szCs w:val="20"/>
+              </w:rPr>
+              <w:t>5</w:t>
+            </w:r>
+          </w:p>
+        </w:tc>
+        <w:tc>
+          <w:tcPr>
+            <w:tcW w:w="1062" w:type="dxa"/>
+          </w:tcPr>
+          <w:p>
+            <w:pPr>
+              <w:ind w:firstLine="0"/>
+              <w:rPr>
+                <w:sz w:val="20"/>
+                <w:szCs w:val="20"/>
+              </w:rPr>
+            </w:pPr>
+            <w:r>
+              <w:rPr>
+                <w:sz w:val="20"/>
+                <w:szCs w:val="20"/>
+              </w:rPr>
+              <w:t>0.01</w:t>
+            </w:r>
+          </w:p>
+        </w:tc>
+        <w:tc>
+          <w:tcPr>
+            <w:tcW w:w="1062" w:type="dxa"/>
+          </w:tcPr>
+          <w:p>
+            <w:pPr>
+              <w:ind w:firstLine="0"/>
+              <w:rPr>
+                <w:sz w:val="20"/>
+                <w:szCs w:val="20"/>
+              </w:rPr>
+            </w:pPr>
+            <w:r>
+              <w:rPr>
+                <w:sz w:val="20"/>
+                <w:szCs w:val="20"/>
+              </w:rPr>
+              <w:t xml:space="preserve">64.0 </w:t>
+            </w:r>
+          </w:p>
+        </w:tc>
+        <w:tc>
+          <w:tcPr>
+            <w:tcW w:w="1062" w:type="dxa"/>
+          </w:tcPr>
+          <w:p>
+            <w:pPr>
+              <w:ind w:firstLine="0"/>
+              <w:rPr>
+                <w:sz w:val="20"/>
+                <w:szCs w:val="20"/>
+              </w:rPr>
+            </w:pPr>
+            <w:r>
+              <w:rPr>
+                <w:sz w:val="20"/>
+                <w:szCs w:val="20"/>
+              </w:rPr>
+              <w:t>0.625</w:t>
+            </w:r>
+          </w:p>
+        </w:tc>
+      </w:tr>
+    </w:tbl>
+    <w:p>
+      <w:pPr>
+        <w:ind w:firstLine="0"/>
+      </w:pPr>
+    </w:p>
+    <w:p>
+      <w:r>
+        <w:t>While the target density is successfully maintained with a less than 2% deviation without user input, c</w:t>
+      </w:r>
+      <w:r>
+        <w:t xml:space="preserve">onsiderable density deviations of up to 30% were observed in cases where </w:t>
+      </w:r>
+      <w:r>
+        <w:t>a great quantity of liquid is pressed into a corner by the user</w:t>
+      </w:r>
+      <w:r>
+        <w:t>.</w:t>
+      </w:r>
+      <w:r>
+        <w:t xml:space="preserve"> </w:t>
+      </w:r>
+      <w:r>
+        <w:t>I</w:t>
+      </w:r>
+      <w:r>
+        <w:t xml:space="preserve">n such cases, the particles get squished together, increasing the number of particles per cell, and therefore also causing a fps drop. In such cases, the recovery to target density and regular frame count is graceful. The liquid simulation is realistic and lifelike, while being visually rich owing to the vorticity confinement. The above parameter set simulates a liquid slightly thicker than water, such as blood. Tuning the viscosity and the artificial pressure coefficient, it is possible to simulate a more viscous, pudding-like fluid. Tuning the relaxation softens the density constraint, allowing the simulation of a more jelly-like substance. </w:t>
+      </w:r>
+    </w:p>
+    <w:p>
+      <w:r>
+        <w:t>One great benefit of position-based methods is their stability even under extremely chaotic conditions. For example, moving the objects in the scene, or shaking the bounding box moves the fluid in a believable and realistic manner, which would be computationally expensive with a force-based simulation.</w:t>
+      </w:r>
+    </w:p>
+    <w:p>
+      <w:pPr>
+        <w:pStyle w:val="Heading2"/>
+      </w:pPr>
+      <w:r>
+        <w:t>Results on RTX 4050</w:t>
+      </w:r>
+    </w:p>
+    <w:p>
+      <w:r>
+        <w:t xml:space="preserve">On the </w:t>
+      </w:r>
+      <w:r>
+        <w:t>NVIDIA GeForce RTX 4050 Laptop GPU</w:t>
+      </w:r>
+      <w:r>
+        <w:t xml:space="preserve">, a particle count of 400k was simulated at 39 fps. </w:t>
+      </w:r>
+    </w:p>
+    <w:p>
+      <w:pPr>
+        <w:keepNext/>
+      </w:pPr>
+      <w:r>
+        <w:drawing>
+          <wp:inline distT="0" distB="0" distL="0" distR="0" wp14:anchorId="0D588C78" wp14:editId="191187ED">
+            <wp:extent cx="4541914" cy="2682472"/>
+            <wp:effectExtent l="0" t="0" r="0" b="3810"/>
+            <wp:docPr id="1769725306" name="Picture 1"/>
+            <wp:cNvGraphicFramePr>
+              <a:graphicFrameLocks xmlns:a="http://schemas.openxmlformats.org/drawingml/2006/main" noChangeAspect="1"/>
+            </wp:cNvGraphicFramePr>
+            <a:graphic xmlns:a="http://schemas.openxmlformats.org/drawingml/2006/main">
+              <a:graphicData uri="http://schemas.openxmlformats.org/drawingml/2006/picture">
+                <pic:pic xmlns:pic="http://schemas.openxmlformats.org/drawingml/2006/picture">
+                  <pic:nvPicPr>
+                    <pic:cNvPr id="1769725306" name=""/>
+                    <pic:cNvPicPr/>
+                  </pic:nvPicPr>
+                  <pic:blipFill>
+                    <a:blip r:embed="rId13"/>
+                    <a:stretch>
+                      <a:fillRect/>
+                    </a:stretch>
+                  </pic:blipFill>
+                  <pic:spPr>
+                    <a:xfrm>
+                      <a:off x="0" y="0"/>
+                      <a:ext cx="4541914" cy="2682472"/>
+                    </a:xfrm>
+                    <a:prstGeom prst="rect">
+                      <a:avLst/>
+                    </a:prstGeom>
+                  </pic:spPr>
+                </pic:pic>
+              </a:graphicData>
+            </a:graphic>
+          </wp:inline>
+        </w:drawing>
+      </w:r>
+    </w:p>
+    <w:p>
+      <w:pPr>
+        <w:pStyle w:val="Caption"/>
+        <w:rPr>
+          <w:noProof/>
+        </w:rPr>
+      </w:pPr>
+      <w:r>
+        <w:t xml:space="preserve">Figure </w:t>
+      </w:r>
+      <w:r>
+        <w:fldChar w:fldCharType="begin"/>
+      </w:r>
+      <w:r>
+        <w:instrText xml:space="preserve"> SEQ Figure \* ARABIC </w:instrText>
+      </w:r>
+      <w:r>
+        <w:fldChar w:fldCharType="separate"/>
+      </w:r>
+      <w:r>
+        <w:rPr>
+          <w:noProof/>
+        </w:rPr>
+        <w:t>4</w:t>
+      </w:r>
+      <w:r>
+        <w:fldChar w:fldCharType="end"/>
+      </w:r>
+      <w:r>
+        <w:t>: FPS as a function of particle count</w:t>
+      </w:r>
+      <w:r>
+        <w:rPr>
+          <w:noProof/>
+        </w:rPr>
+        <w:t xml:space="preserve"> on the RTX 4050</w:t>
+      </w:r>
+    </w:p>
+    <w:p>
+      <w:r>
+        <w:lastRenderedPageBreak/>
+        <w:t>As measured using Nvidia Nsight Graphics, o</w:t>
+      </w:r>
+      <w:r>
+        <w:t xml:space="preserve">n average, at </w:t>
+      </w:r>
+      <w:r>
+        <w:t>400k particles</w:t>
+      </w:r>
+      <w:r>
+        <w:t xml:space="preserve">, the construction of a frame took </w:t>
+      </w:r>
+      <w:r>
+        <w:t xml:space="preserve">~35ms. This showcases the utility of the parallelism between the two command queues: even with each frame taking ~35ms to produce, we get to display a frame every ~25ms by overlapping the graphics commands for frame N-1 with the compute of frame N. The heaviest operations during the construction of a frame, </w:t>
+      </w:r>
+      <w:r>
+        <w:t>in decreasing order</w:t>
+      </w:r>
+      <w:r>
+        <w:t xml:space="preserve"> are:</w:t>
+      </w:r>
     </w:p>
     <w:p>
       <w:pPr>
         <w:pStyle w:val="ListParagraph"/>
         <w:numPr>
           <w:ilvl w:val="0"/>
-          <w:numId w:val="20"/>
+          <w:numId w:val="36"/>
         </w:numPr>
       </w:pPr>
       <w:r>
-        <w:t>Gsm</w:t>
+        <w:t xml:space="preserve">Calculating λ and </w:t>
+      </w:r>
+      <w:proofErr w:type="spellStart"/>
+      <w:r>
+        <w:t>Δx</w:t>
+      </w:r>
+      <w:proofErr w:type="spellEnd"/>
+      <w:r>
+        <w:t>: ~</w:t>
+      </w:r>
+      <w:r>
+        <w:t>1-</w:t>
+      </w:r>
+      <w:r>
+        <w:t>2ms each</w:t>
+      </w:r>
+    </w:p>
+    <w:p>
+      <w:pPr>
+        <w:pStyle w:val="ListParagraph"/>
+        <w:numPr>
+          <w:ilvl w:val="1"/>
+          <w:numId w:val="36"/>
+        </w:numPr>
+      </w:pPr>
+      <w:r>
+        <w:t>Note that this is paid as many times as there are iterations in the constraint projection loop.</w:t>
+      </w:r>
+    </w:p>
+    <w:p>
+      <w:pPr>
+        <w:pStyle w:val="ListParagraph"/>
+        <w:numPr>
+          <w:ilvl w:val="1"/>
+          <w:numId w:val="36"/>
+        </w:numPr>
+      </w:pPr>
+      <w:r>
+        <w:t xml:space="preserve">Note that the first few of these passes are heavier, closer to 2ms, while the last few are lighter, closer to 1ms. This is </w:t>
+      </w:r>
+      <w:proofErr w:type="gramStart"/>
+      <w:r>
+        <w:t>due to the fact that</w:t>
+      </w:r>
+      <w:proofErr w:type="gramEnd"/>
+      <w:r>
+        <w:t xml:space="preserve"> the threads associated with lower LOD particles quit early in the later iterations.</w:t>
       </w:r>
     </w:p>
     <w:p>
@@ -23530,28 +24001,23 @@
         <w:pStyle w:val="ListParagraph"/>
         <w:numPr>
           <w:ilvl w:val="0"/>
-          <w:numId w:val="20"/>
+          <w:numId w:val="36"/>
         </w:numPr>
       </w:pPr>
       <w:r>
-        <w:t xml:space="preserve">Cella </w:t>
-      </w:r>
-      <w:proofErr w:type="spellStart"/>
-      <w:r>
-        <w:t>méret</w:t>
-      </w:r>
-      <w:proofErr w:type="spellEnd"/>
+        <w:t>Calculating viscosity and applying vorticity confinement: ~3-4ms</w:t>
+      </w:r>
     </w:p>
     <w:p>
       <w:pPr>
         <w:pStyle w:val="ListParagraph"/>
         <w:numPr>
           <w:ilvl w:val="0"/>
-          <w:numId w:val="20"/>
+          <w:numId w:val="36"/>
         </w:numPr>
       </w:pPr>
       <w:r>
-        <w:t>LOD</w:t>
+        <w:t>Constructing the 3D density texture: ~3ms</w:t>
       </w:r>
     </w:p>
     <w:p>
@@ -23559,48 +24025,606 @@
         <w:pStyle w:val="ListParagraph"/>
         <w:numPr>
           <w:ilvl w:val="0"/>
-          <w:numId w:val="20"/>
+          <w:numId w:val="36"/>
         </w:numPr>
       </w:pPr>
-      <w:proofErr w:type="spellStart"/>
-      <w:r>
-        <w:t>Kisebb</w:t>
-      </w:r>
-      <w:proofErr w:type="spellEnd"/>
-      <w:r>
-        <w:t xml:space="preserve"> h, </w:t>
-      </w:r>
-      <w:proofErr w:type="spellStart"/>
-      <w:r>
-        <w:t>nagyobb</w:t>
-      </w:r>
-      <w:proofErr w:type="spellEnd"/>
-      <w:r>
-        <w:t xml:space="preserve"> </w:t>
-      </w:r>
-      <w:proofErr w:type="spellStart"/>
-      <w:r>
-        <w:t>iterációszám</w:t>
-      </w:r>
-      <w:proofErr w:type="spellEnd"/>
+      <w:r>
+        <w:t>Calculating vorticity ~2.5ms</w:t>
+      </w:r>
     </w:p>
     <w:p>
       <w:pPr>
         <w:pStyle w:val="ListParagraph"/>
         <w:numPr>
           <w:ilvl w:val="0"/>
-          <w:numId w:val="20"/>
+          <w:numId w:val="36"/>
         </w:numPr>
       </w:pPr>
       <w:r>
-        <w:t xml:space="preserve">3d density texture compute </w:t>
+        <w:t>Drawing the liquid surface ~1.5ms, of which a majority is the SPH density gradient evaluation, rather than the ray marching steps.</w:t>
+      </w:r>
+    </w:p>
+    <w:p>
+      <w:pPr>
+        <w:pStyle w:val="Heading2"/>
+      </w:pPr>
+      <w:r>
+        <w:t>Results on RTX 3080</w:t>
+      </w:r>
+    </w:p>
+    <w:p>
+      <w:pPr>
+        <w:pStyle w:val="Heading2"/>
+      </w:pPr>
+      <w:r>
+        <w:t>Attempts at further optimization</w:t>
+      </w:r>
+    </w:p>
+    <w:p>
+      <w:pPr>
+        <w:ind w:firstLine="0"/>
+      </w:pPr>
+      <w:r>
+        <w:t>Beyond the optimizations already presented</w:t>
+      </w:r>
+      <w:r>
+        <w:t xml:space="preserve"> - </w:t>
+      </w:r>
+      <w:r>
+        <w:t>parallel prefix sum, Morton codes, and adaptive PBF</w:t>
+      </w:r>
+      <w:r>
+        <w:t xml:space="preserve"> - </w:t>
+      </w:r>
+      <w:r>
+        <w:t xml:space="preserve">two additional optimization attempts were explored that ultimately yielded no measurable FPS </w:t>
+      </w:r>
+      <w:proofErr w:type="gramStart"/>
+      <w:r>
+        <w:t>improvement</w:t>
+      </w:r>
+      <w:r>
+        <w:t>, or</w:t>
+      </w:r>
+      <w:proofErr w:type="gramEnd"/>
+      <w:r>
+        <w:t xml:space="preserve"> even lead to FPS degradation</w:t>
+      </w:r>
+      <w:r>
+        <w:t>:</w:t>
+      </w:r>
+      <w:r>
+        <w:t xml:space="preserve"> </w:t>
+      </w:r>
+      <w:r>
+        <w:t xml:space="preserve">The additional computational overhead offered by these changes outweighed </w:t>
+      </w:r>
+      <w:r>
+        <w:t>any possible gain.</w:t>
+      </w:r>
+    </w:p>
+    <w:bookmarkEnd w:id="24"/>
+    <w:p>
+      <w:pPr>
+        <w:pStyle w:val="Heading3"/>
+      </w:pPr>
+      <w:r>
+        <w:t>Group Shared Memory (GSM) utilization</w:t>
+      </w:r>
+    </w:p>
+    <w:p>
+      <w:r>
+        <w:t xml:space="preserve">Even after sorting the particles’ data according to their cells’ Morton codes, profiling </w:t>
+      </w:r>
+      <w:r>
+        <w:t xml:space="preserve">still </w:t>
+      </w:r>
+      <w:r>
+        <w:t>showed frequent LGSB stalls in neighbour lookup</w:t>
+      </w:r>
+      <w:r>
+        <w:t>s. These indicate cache misses, which I attempted to minimize using shared memory:</w:t>
+      </w:r>
+    </w:p>
+    <w:p>
+      <w:pPr>
+        <w:pStyle w:val="ListParagraph"/>
+        <w:numPr>
+          <w:ilvl w:val="0"/>
+          <w:numId w:val="37"/>
+        </w:numPr>
+      </w:pPr>
+      <w:r>
+        <w:lastRenderedPageBreak/>
+        <w:t xml:space="preserve">Before running computations, each thread in the thread group pre-loads its data into group shared memory (GSM). </w:t>
+      </w:r>
+    </w:p>
+    <w:p>
+      <w:pPr>
+        <w:pStyle w:val="ListParagraph"/>
+        <w:numPr>
+          <w:ilvl w:val="0"/>
+          <w:numId w:val="37"/>
+        </w:numPr>
+      </w:pPr>
+      <w:r>
+        <w:t>SPH neighbour lookup loops where contribution of particles is a matter of summing over neighbours break down into two phases:</w:t>
+      </w:r>
+    </w:p>
+    <w:p>
+      <w:pPr>
+        <w:pStyle w:val="ListParagraph"/>
+        <w:numPr>
+          <w:ilvl w:val="1"/>
+          <w:numId w:val="37"/>
+        </w:numPr>
+      </w:pPr>
+      <w:r>
+        <w:t xml:space="preserve">GSM pass: all threads in the group iterate over the GSM in the same order, adding the contribution of GSM-stored particles to their own local sum. </w:t>
+      </w:r>
+    </w:p>
+    <w:p>
+      <w:pPr>
+        <w:pStyle w:val="ListParagraph"/>
+        <w:numPr>
+          <w:ilvl w:val="2"/>
+          <w:numId w:val="37"/>
+        </w:numPr>
+      </w:pPr>
+      <w:r>
+        <w:t>These accesses are broadcast for all threads, resulting in fast data access.</w:t>
+      </w:r>
+    </w:p>
+    <w:p>
+      <w:pPr>
+        <w:pStyle w:val="ListParagraph"/>
+        <w:numPr>
+          <w:ilvl w:val="2"/>
+          <w:numId w:val="37"/>
+        </w:numPr>
+      </w:pPr>
+      <w:r>
+        <w:t>Although Morton codes attempt to maximize spatial locality for nearby indices, there will be threads in the group whose particles aren’t neighbours. Their contribution will automatically be 0 as per the rules of SPH smoothing kernel.</w:t>
+      </w:r>
+    </w:p>
+    <w:p>
+      <w:pPr>
+        <w:pStyle w:val="ListParagraph"/>
+        <w:numPr>
+          <w:ilvl w:val="1"/>
+          <w:numId w:val="37"/>
+        </w:numPr>
+      </w:pPr>
+      <w:r>
+        <w:t xml:space="preserve">Residual pass: Particles which are potential neighbours, but their threads were not in the same thread group were skipped in the GSM pass. They are </w:t>
+      </w:r>
+      <w:proofErr w:type="gramStart"/>
+      <w:r>
+        <w:t>taken into account</w:t>
+      </w:r>
+      <w:proofErr w:type="gramEnd"/>
+      <w:r>
+        <w:t xml:space="preserve"> during this secondary pass, which fetches data via the regular L1-L2-VRAM path.</w:t>
+      </w:r>
+    </w:p>
+    <w:p>
+      <w:pPr>
+        <w:pStyle w:val="Heading3"/>
+      </w:pPr>
+      <w:r>
+        <w:t>Sub-particle-spacing cell size</w:t>
+      </w:r>
+    </w:p>
+    <w:p>
+      <w:r>
+        <w:t xml:space="preserve">During neighbour lookups in SPH sums, the SPH kernel functions are evaluated for all potential neighbour particles. These particles </w:t>
+      </w:r>
+      <w:proofErr w:type="gramStart"/>
+      <w:r>
+        <w:t>are considered to be</w:t>
+      </w:r>
+      <w:proofErr w:type="gramEnd"/>
+      <w:r>
+        <w:t xml:space="preserve"> potential neighbours if they are in an adjacent grid cell. Grid cells have side length equal to the SPH kernel radius</w:t>
+      </w:r>
+      <w:r>
+        <w:t xml:space="preserve"> </w:t>
+      </w:r>
+      <m:oMath>
+        <m:r>
+          <w:rPr>
+            <w:rFonts w:ascii="Cambria Math" w:hAnsi="Cambria Math"/>
+          </w:rPr>
+          <m:t>h</m:t>
+        </m:r>
+      </m:oMath>
+      <w:r>
+        <w:t xml:space="preserve">, so that all actual neighbours are guaranteed to be among the potential neighbours. </w:t>
+      </w:r>
+      <w:r>
+        <w:t xml:space="preserve">Maximizing the ratio of actual neighbours within the set of potential neighbours would lower unnecessary particle data access, as well as the number of SPH kernel evaluations that end up being 0. </w:t>
+      </w:r>
+      <w:r>
+        <w:t xml:space="preserve">Using a grid cell size an integer fraction of </w:t>
+      </w:r>
+      <m:oMath>
+        <m:r>
+          <w:rPr>
+            <w:rFonts w:ascii="Cambria Math" w:hAnsi="Cambria Math"/>
+          </w:rPr>
+          <m:t>h</m:t>
+        </m:r>
+      </m:oMath>
+      <w:r>
+        <w:t xml:space="preserve"> </w:t>
+      </w:r>
+      <w:r>
+        <w:t>this increases the ratio of actual neighbours within potential neighbours for two reasons:</w:t>
+      </w:r>
+      <w:r>
+        <w:t xml:space="preserve"> </w:t>
+      </w:r>
+    </w:p>
+    <w:p>
+      <w:pPr>
+        <w:pStyle w:val="ListParagraph"/>
+        <w:numPr>
+          <w:ilvl w:val="0"/>
+          <w:numId w:val="38"/>
+        </w:numPr>
+      </w:pPr>
+      <w:r>
+        <w:t>With a finer grid cell size, cells at the corners of the potential neighbour cube can be omitted, bringing the checked volume’s shape closer to the sphere that contains the actual neighbours.</w:t>
+      </w:r>
+    </w:p>
+    <w:p>
+      <w:pPr>
+        <w:pStyle w:val="ListParagraph"/>
+        <w:numPr>
+          <w:ilvl w:val="0"/>
+          <w:numId w:val="38"/>
+        </w:numPr>
+      </w:pPr>
+      <w:r>
+        <w:t xml:space="preserve">With the current scheme, the volume of the area, where potential neighbours are sought is </w:t>
+      </w:r>
+      <m:oMath>
+        <m:r>
+          <w:rPr>
+            <w:rFonts w:ascii="Cambria Math" w:hAnsi="Cambria Math"/>
+          </w:rPr>
+          <m:t>27</m:t>
+        </m:r>
+        <m:sSup>
+          <m:sSupPr>
+            <m:ctrlPr>
+              <w:rPr>
+                <w:rFonts w:ascii="Cambria Math" w:hAnsi="Cambria Math"/>
+                <w:i/>
+              </w:rPr>
+            </m:ctrlPr>
+          </m:sSupPr>
+          <m:e>
+            <m:r>
+              <w:rPr>
+                <w:rFonts w:ascii="Cambria Math" w:hAnsi="Cambria Math"/>
+              </w:rPr>
+              <m:t>h</m:t>
+            </m:r>
+          </m:e>
+          <m:sup>
+            <m:r>
+              <w:rPr>
+                <w:rFonts w:ascii="Cambria Math" w:hAnsi="Cambria Math"/>
+              </w:rPr>
+              <m:t>3</m:t>
+            </m:r>
+          </m:sup>
+        </m:sSup>
+      </m:oMath>
+      <w:r>
+        <w:t xml:space="preserve">, as we check all adjacent cells, each of which has volume </w:t>
+      </w:r>
+      <m:oMath>
+        <m:sSup>
+          <m:sSupPr>
+            <m:ctrlPr>
+              <w:rPr>
+                <w:rFonts w:ascii="Cambria Math" w:hAnsi="Cambria Math"/>
+                <w:i/>
+              </w:rPr>
+            </m:ctrlPr>
+          </m:sSupPr>
+          <m:e>
+            <m:r>
+              <w:rPr>
+                <w:rFonts w:ascii="Cambria Math" w:hAnsi="Cambria Math"/>
+              </w:rPr>
+              <m:t>h</m:t>
+            </m:r>
+          </m:e>
+          <m:sup>
+            <m:r>
+              <w:rPr>
+                <w:rFonts w:ascii="Cambria Math" w:hAnsi="Cambria Math"/>
+              </w:rPr>
+              <m:t>3</m:t>
+            </m:r>
+          </m:sup>
+        </m:sSup>
+      </m:oMath>
+      <w:r>
+        <w:t>.</w:t>
+      </w:r>
+      <w:r>
+        <w:t xml:space="preserve"> If </w:t>
+      </w:r>
+      <w:r>
+        <w:lastRenderedPageBreak/>
+        <w:t xml:space="preserve">cells have a side length of </w:t>
+      </w:r>
+      <m:oMath>
+        <m:f>
+          <m:fPr>
+            <m:type m:val="skw"/>
+            <m:ctrlPr>
+              <w:rPr>
+                <w:rFonts w:ascii="Cambria Math" w:hAnsi="Cambria Math"/>
+                <w:i/>
+              </w:rPr>
+            </m:ctrlPr>
+          </m:fPr>
+          <m:num>
+            <m:r>
+              <w:rPr>
+                <w:rFonts w:ascii="Cambria Math" w:hAnsi="Cambria Math"/>
+              </w:rPr>
+              <m:t>h</m:t>
+            </m:r>
+          </m:num>
+          <m:den>
+            <m:r>
+              <w:rPr>
+                <w:rFonts w:ascii="Cambria Math" w:hAnsi="Cambria Math"/>
+              </w:rPr>
+              <m:t>n</m:t>
+            </m:r>
+          </m:den>
+        </m:f>
+      </m:oMath>
+      <w:r>
+        <w:t xml:space="preserve">, each cell has a volume of </w:t>
+      </w:r>
+      <m:oMath>
+        <m:sSup>
+          <m:sSupPr>
+            <m:ctrlPr>
+              <w:rPr>
+                <w:rFonts w:ascii="Cambria Math" w:hAnsi="Cambria Math"/>
+                <w:i/>
+              </w:rPr>
+            </m:ctrlPr>
+          </m:sSupPr>
+          <m:e>
+            <m:d>
+              <m:dPr>
+                <m:ctrlPr>
+                  <w:rPr>
+                    <w:rFonts w:ascii="Cambria Math" w:hAnsi="Cambria Math"/>
+                    <w:i/>
+                  </w:rPr>
+                </m:ctrlPr>
+              </m:dPr>
+              <m:e>
+                <m:f>
+                  <m:fPr>
+                    <m:type m:val="skw"/>
+                    <m:ctrlPr>
+                      <w:rPr>
+                        <w:rFonts w:ascii="Cambria Math" w:hAnsi="Cambria Math"/>
+                        <w:i/>
+                      </w:rPr>
+                    </m:ctrlPr>
+                  </m:fPr>
+                  <m:num>
+                    <m:r>
+                      <w:rPr>
+                        <w:rFonts w:ascii="Cambria Math" w:hAnsi="Cambria Math"/>
+                      </w:rPr>
+                      <m:t>h</m:t>
+                    </m:r>
+                  </m:num>
+                  <m:den>
+                    <m:r>
+                      <w:rPr>
+                        <w:rFonts w:ascii="Cambria Math" w:hAnsi="Cambria Math"/>
+                      </w:rPr>
+                      <m:t>n</m:t>
+                    </m:r>
+                  </m:den>
+                </m:f>
+              </m:e>
+            </m:d>
+          </m:e>
+          <m:sup>
+            <m:r>
+              <w:rPr>
+                <w:rFonts w:ascii="Cambria Math" w:hAnsi="Cambria Math"/>
+              </w:rPr>
+              <m:t>3</m:t>
+            </m:r>
+          </m:sup>
+        </m:sSup>
+      </m:oMath>
+      <w:r>
+        <w:t xml:space="preserve">, however, checking only adjacent cells for potential neighbours is no longer satisfactory. Instead, we must check cells that are </w:t>
+      </w:r>
+      <m:oMath>
+        <m:r>
+          <w:rPr>
+            <w:rFonts w:ascii="Cambria Math" w:hAnsi="Cambria Math"/>
+          </w:rPr>
+          <m:t>n</m:t>
+        </m:r>
+      </m:oMath>
+      <w:r>
+        <w:t xml:space="preserve"> away in each direction, </w:t>
+      </w:r>
+      <m:oMath>
+        <m:sSup>
+          <m:sSupPr>
+            <m:ctrlPr>
+              <w:rPr>
+                <w:rFonts w:ascii="Cambria Math" w:hAnsi="Cambria Math"/>
+                <w:i/>
+              </w:rPr>
+            </m:ctrlPr>
+          </m:sSupPr>
+          <m:e>
+            <m:d>
+              <m:dPr>
+                <m:ctrlPr>
+                  <w:rPr>
+                    <w:rFonts w:ascii="Cambria Math" w:hAnsi="Cambria Math"/>
+                    <w:i/>
+                  </w:rPr>
+                </m:ctrlPr>
+              </m:dPr>
+              <m:e>
+                <m:r>
+                  <w:rPr>
+                    <w:rFonts w:ascii="Cambria Math" w:hAnsi="Cambria Math"/>
+                  </w:rPr>
+                  <m:t>2n+1</m:t>
+                </m:r>
+              </m:e>
+            </m:d>
+          </m:e>
+          <m:sup>
+            <m:r>
+              <w:rPr>
+                <w:rFonts w:ascii="Cambria Math" w:hAnsi="Cambria Math"/>
+              </w:rPr>
+              <m:t>3</m:t>
+            </m:r>
+          </m:sup>
+        </m:sSup>
+      </m:oMath>
+      <w:r>
+        <w:t xml:space="preserve"> cells overall. The volume to check for neighbours is then only </w:t>
+      </w:r>
+      <m:oMath>
+        <m:sSup>
+          <m:sSupPr>
+            <m:ctrlPr>
+              <w:rPr>
+                <w:rFonts w:ascii="Cambria Math" w:hAnsi="Cambria Math"/>
+                <w:i/>
+              </w:rPr>
+            </m:ctrlPr>
+          </m:sSupPr>
+          <m:e>
+            <m:d>
+              <m:dPr>
+                <m:ctrlPr>
+                  <w:rPr>
+                    <w:rFonts w:ascii="Cambria Math" w:hAnsi="Cambria Math"/>
+                    <w:i/>
+                  </w:rPr>
+                </m:ctrlPr>
+              </m:dPr>
+              <m:e>
+                <m:r>
+                  <w:rPr>
+                    <w:rFonts w:ascii="Cambria Math" w:hAnsi="Cambria Math"/>
+                  </w:rPr>
+                  <m:t>2+</m:t>
+                </m:r>
+                <m:f>
+                  <m:fPr>
+                    <m:ctrlPr>
+                      <w:rPr>
+                        <w:rFonts w:ascii="Cambria Math" w:hAnsi="Cambria Math"/>
+                        <w:i/>
+                      </w:rPr>
+                    </m:ctrlPr>
+                  </m:fPr>
+                  <m:num>
+                    <m:r>
+                      <w:rPr>
+                        <w:rFonts w:ascii="Cambria Math" w:hAnsi="Cambria Math"/>
+                      </w:rPr>
+                      <m:t>1</m:t>
+                    </m:r>
+                  </m:num>
+                  <m:den>
+                    <m:r>
+                      <w:rPr>
+                        <w:rFonts w:ascii="Cambria Math" w:hAnsi="Cambria Math"/>
+                      </w:rPr>
+                      <m:t>n</m:t>
+                    </m:r>
+                  </m:den>
+                </m:f>
+              </m:e>
+            </m:d>
+          </m:e>
+          <m:sup>
+            <m:r>
+              <w:rPr>
+                <w:rFonts w:ascii="Cambria Math" w:hAnsi="Cambria Math"/>
+              </w:rPr>
+              <m:t>3</m:t>
+            </m:r>
+          </m:sup>
+        </m:sSup>
+        <m:sSup>
+          <m:sSupPr>
+            <m:ctrlPr>
+              <w:rPr>
+                <w:rFonts w:ascii="Cambria Math" w:hAnsi="Cambria Math"/>
+                <w:i/>
+              </w:rPr>
+            </m:ctrlPr>
+          </m:sSupPr>
+          <m:e>
+            <m:r>
+              <w:rPr>
+                <w:rFonts w:ascii="Cambria Math" w:hAnsi="Cambria Math"/>
+              </w:rPr>
+              <m:t>h</m:t>
+            </m:r>
+          </m:e>
+          <m:sup>
+            <m:r>
+              <w:rPr>
+                <w:rFonts w:ascii="Cambria Math" w:hAnsi="Cambria Math"/>
+              </w:rPr>
+              <m:t>3</m:t>
+            </m:r>
+          </m:sup>
+        </m:sSup>
+      </m:oMath>
+      <w:r>
+        <w:t>.</w:t>
+      </w:r>
+    </w:p>
+    <w:p/>
+    <w:p/>
+    <w:p>
+      <w:pPr>
+        <w:ind w:firstLine="0"/>
+      </w:pPr>
+    </w:p>
+    <w:p>
+      <w:r>
+        <w:t xml:space="preserve"> </w:t>
       </w:r>
     </w:p>
     <w:p/>
     <w:p/>
     <w:p/>
     <w:p/>
-    <w:p/>
     <w:p>
       <w:pPr>
         <w:pStyle w:val="Heading1"/>
@@ -24088,6 +25112,7 @@
         <w:rPr>
           <w:noProof/>
         </w:rPr>
+        <w:lastRenderedPageBreak/>
         <w:drawing>
           <wp:inline distT="0" distB="0" distL="0" distR="0" wp14:anchorId="33527B03" wp14:editId="13D87D0B">
             <wp:extent cx="4781550" cy="466725"/>
@@ -24106,7 +25131,7 @@
                     </pic:cNvPicPr>
                   </pic:nvPicPr>
                   <pic:blipFill>
-                    <a:blip r:embed="rId13">
+                    <a:blip r:embed="rId14">
                       <a:extLst>
                         <a:ext uri="{28A0092B-C50C-407E-A947-70E740481C1C}">
                           <a14:useLocalDpi xmlns:a14="http://schemas.microsoft.com/office/drawing/2010/main" val="0"/>
@@ -24416,7 +25441,6 @@
         <w:pStyle w:val="Kd"/>
       </w:pPr>
       <w:r>
-        <w:lastRenderedPageBreak/>
         <w:tab/>
       </w:r>
       <w:r>
@@ -25291,6 +26315,7 @@
         <w:rPr>
           <w:rStyle w:val="Emphasis"/>
         </w:rPr>
+        <w:lastRenderedPageBreak/>
         <w:t>Kinézet</w:t>
       </w:r>
       <w:proofErr w:type="spellEnd"/>
@@ -25390,7 +26415,6 @@
       <w:bookmarkStart w:id="39" w:name="_Toc229611193"/>
       <w:proofErr w:type="spellStart"/>
       <w:r>
-        <w:lastRenderedPageBreak/>
         <w:t>Irodalomjegyzék</w:t>
       </w:r>
       <w:proofErr w:type="spellEnd"/>
@@ -25633,19 +26657,7 @@
         <w:rPr>
           <w:noProof w:val="0"/>
         </w:rPr>
-        <w:instrText>HYPERLINK "</w:instrText>
-      </w:r>
-      <w:r>
-        <w:rPr>
-          <w:noProof w:val="0"/>
-        </w:rPr>
-        <w:instrText>https://courses.grainger.illinois.edu/CS418/sp2023/text/sph.html</w:instrText>
-      </w:r>
-      <w:r>
-        <w:rPr>
-          <w:noProof w:val="0"/>
-        </w:rPr>
-        <w:instrText>"</w:instrText>
+        <w:instrText>HYPERLINK "https://courses.grainger.illinois.edu/CS418/sp2023/text/sph.html"</w:instrText>
       </w:r>
       <w:r>
         <w:rPr>
@@ -25712,7 +26724,7 @@
           <w:noProof w:val="0"/>
         </w:rPr>
       </w:pPr>
-      <w:hyperlink r:id="rId14" w:history="1">
+      <w:hyperlink r:id="rId15" w:history="1">
         <w:bookmarkStart w:id="51" w:name="_Ref229608093"/>
         <w:r>
           <w:rPr>
@@ -25742,19 +26754,7 @@
         <w:rPr>
           <w:noProof w:val="0"/>
         </w:rPr>
-        <w:instrText>HYPERLINK "</w:instrText>
-      </w:r>
-      <w:r>
-        <w:rPr>
-          <w:noProof w:val="0"/>
-        </w:rPr>
-        <w:instrText>https://developer.nvidia.com/gpugems/gpugems3/part-vi-gpu-computing/chapter-39-parallel-prefix-sum-scan-cuda</w:instrText>
-      </w:r>
-      <w:r>
-        <w:rPr>
-          <w:noProof w:val="0"/>
-        </w:rPr>
-        <w:instrText>"</w:instrText>
+        <w:instrText>HYPERLINK "https://developer.nvidia.com/gpugems/gpugems3/part-vi-gpu-computing/chapter-39-parallel-prefix-sum-scan-cuda"</w:instrText>
       </w:r>
       <w:r>
         <w:rPr>
@@ -25800,19 +26800,7 @@
         <w:rPr>
           <w:noProof w:val="0"/>
         </w:rPr>
-        <w:instrText>HYPERLINK "</w:instrText>
-      </w:r>
-      <w:r>
-        <w:rPr>
-          <w:noProof w:val="0"/>
-        </w:rPr>
-        <w:instrText>https://microsoft.github.io/DirectX-Specs/d3d/WorkGraphs.html</w:instrText>
-      </w:r>
-      <w:r>
-        <w:rPr>
-          <w:noProof w:val="0"/>
-        </w:rPr>
-        <w:instrText>"</w:instrText>
+        <w:instrText>HYPERLINK "https://microsoft.github.io/DirectX-Specs/d3d/WorkGraphs.html"</w:instrText>
       </w:r>
       <w:r>
         <w:rPr>
@@ -25858,19 +26846,7 @@
         <w:rPr>
           <w:noProof w:val="0"/>
         </w:rPr>
-        <w:instrText>HYPERLINK "</w:instrText>
-      </w:r>
-      <w:r>
-        <w:rPr>
-          <w:noProof w:val="0"/>
-        </w:rPr>
-        <w:instrText>https://developer.nvidia.com/gpugems/gpugems3/part-v-physics-simulation/chapter-34-signed-distance-fields-using-single-pass-gpu</w:instrText>
-      </w:r>
-      <w:r>
-        <w:rPr>
-          <w:noProof w:val="0"/>
-        </w:rPr>
-        <w:instrText>"</w:instrText>
+        <w:instrText>HYPERLINK "https://developer.nvidia.com/gpugems/gpugems3/part-v-physics-simulation/chapter-34-signed-distance-fields-using-single-pass-gpu"</w:instrText>
       </w:r>
       <w:r>
         <w:rPr>
@@ -25932,19 +26908,12 @@
         <w:rPr>
           <w:noProof w:val="0"/>
         </w:rPr>
-        <w:instrText>HYPERLINK "</w:instrText>
+        <w:instrText>HYPERLINK "https://github.com/ocornut/imgui"</w:instrText>
       </w:r>
       <w:r>
         <w:rPr>
           <w:noProof w:val="0"/>
         </w:rPr>
-        <w:instrText>https://github.com/ocornut/imgui</w:instrText>
-      </w:r>
-      <w:r>
-        <w:rPr>
-          <w:noProof w:val="0"/>
-        </w:rPr>
-        <w:instrText>"</w:instrText>
       </w:r>
       <w:r>
         <w:rPr>
@@ -29612,8 +30581,8 @@
       </w:pPr>
     </w:p>
     <w:sectPr>
-      <w:headerReference w:type="even" r:id="rId15"/>
-      <w:footerReference w:type="default" r:id="rId16"/>
+      <w:headerReference w:type="even" r:id="rId16"/>
+      <w:footerReference w:type="default" r:id="rId17"/>
       <w:type w:val="continuous"/>
       <w:pgSz w:w="11907" w:h="16840" w:code="9"/>
       <w:pgMar w:top="1418" w:right="1418" w:bottom="1418" w:left="1418" w:header="709" w:footer="709" w:gutter="567"/>
@@ -31025,6 +31994,92 @@
     </w:lvl>
   </w:abstractNum>
   <w:abstractNum w:abstractNumId="14" w15:restartNumberingAfterBreak="0">
+    <w:nsid w:val="2F2E3B6E"/>
+    <w:multiLevelType w:val="hybridMultilevel"/>
+    <w:tmpl w:val="63066540"/>
+    <w:lvl w:ilvl="0" w:tplc="0409000F">
+      <w:start w:val="1"/>
+      <w:numFmt w:val="decimal"/>
+      <w:lvlText w:val="%1."/>
+      <w:lvlJc w:val="left"/>
+      <w:pPr>
+        <w:ind w:left="720" w:hanging="360"/>
+      </w:pPr>
+    </w:lvl>
+    <w:lvl w:ilvl="1" w:tplc="04090019">
+      <w:start w:val="1"/>
+      <w:numFmt w:val="lowerLetter"/>
+      <w:lvlText w:val="%2."/>
+      <w:lvlJc w:val="left"/>
+      <w:pPr>
+        <w:ind w:left="1440" w:hanging="360"/>
+      </w:pPr>
+    </w:lvl>
+    <w:lvl w:ilvl="2" w:tplc="0409001B">
+      <w:start w:val="1"/>
+      <w:numFmt w:val="lowerRoman"/>
+      <w:lvlText w:val="%3."/>
+      <w:lvlJc w:val="right"/>
+      <w:pPr>
+        <w:ind w:left="2160" w:hanging="180"/>
+      </w:pPr>
+    </w:lvl>
+    <w:lvl w:ilvl="3" w:tplc="0409000F" w:tentative="1">
+      <w:start w:val="1"/>
+      <w:numFmt w:val="decimal"/>
+      <w:lvlText w:val="%4."/>
+      <w:lvlJc w:val="left"/>
+      <w:pPr>
+        <w:ind w:left="2880" w:hanging="360"/>
+      </w:pPr>
+    </w:lvl>
+    <w:lvl w:ilvl="4" w:tplc="04090019" w:tentative="1">
+      <w:start w:val="1"/>
+      <w:numFmt w:val="lowerLetter"/>
+      <w:lvlText w:val="%5."/>
+      <w:lvlJc w:val="left"/>
+      <w:pPr>
+        <w:ind w:left="3600" w:hanging="360"/>
+      </w:pPr>
+    </w:lvl>
+    <w:lvl w:ilvl="5" w:tplc="0409001B" w:tentative="1">
+      <w:start w:val="1"/>
+      <w:numFmt w:val="lowerRoman"/>
+      <w:lvlText w:val="%6."/>
+      <w:lvlJc w:val="right"/>
+      <w:pPr>
+        <w:ind w:left="4320" w:hanging="180"/>
+      </w:pPr>
+    </w:lvl>
+    <w:lvl w:ilvl="6" w:tplc="0409000F" w:tentative="1">
+      <w:start w:val="1"/>
+      <w:numFmt w:val="decimal"/>
+      <w:lvlText w:val="%7."/>
+      <w:lvlJc w:val="left"/>
+      <w:pPr>
+        <w:ind w:left="5040" w:hanging="360"/>
+      </w:pPr>
+    </w:lvl>
+    <w:lvl w:ilvl="7" w:tplc="04090019" w:tentative="1">
+      <w:start w:val="1"/>
+      <w:numFmt w:val="lowerLetter"/>
+      <w:lvlText w:val="%8."/>
+      <w:lvlJc w:val="left"/>
+      <w:pPr>
+        <w:ind w:left="5760" w:hanging="360"/>
+      </w:pPr>
+    </w:lvl>
+    <w:lvl w:ilvl="8" w:tplc="0409001B" w:tentative="1">
+      <w:start w:val="1"/>
+      <w:numFmt w:val="lowerRoman"/>
+      <w:lvlText w:val="%9."/>
+      <w:lvlJc w:val="right"/>
+      <w:pPr>
+        <w:ind w:left="6480" w:hanging="180"/>
+      </w:pPr>
+    </w:lvl>
+  </w:abstractNum>
+  <w:abstractNum w:abstractNumId="15" w15:restartNumberingAfterBreak="0">
     <w:nsid w:val="2F783801"/>
     <w:multiLevelType w:val="hybridMultilevel"/>
     <w:tmpl w:val="6CCAF9A8"/>
@@ -31110,7 +32165,7 @@
       </w:pPr>
     </w:lvl>
   </w:abstractNum>
-  <w:abstractNum w:abstractNumId="15" w15:restartNumberingAfterBreak="0">
+  <w:abstractNum w:abstractNumId="16" w15:restartNumberingAfterBreak="0">
     <w:nsid w:val="32911BFF"/>
     <w:multiLevelType w:val="hybridMultilevel"/>
     <w:tmpl w:val="6EB0B768"/>
@@ -31223,7 +32278,7 @@
       </w:rPr>
     </w:lvl>
   </w:abstractNum>
-  <w:abstractNum w:abstractNumId="16" w15:restartNumberingAfterBreak="0">
+  <w:abstractNum w:abstractNumId="17" w15:restartNumberingAfterBreak="0">
     <w:nsid w:val="3353475A"/>
     <w:multiLevelType w:val="multilevel"/>
     <w:tmpl w:val="418E4214"/>
@@ -31310,7 +32365,120 @@
       </w:pPr>
     </w:lvl>
   </w:abstractNum>
-  <w:abstractNum w:abstractNumId="17" w15:restartNumberingAfterBreak="0">
+  <w:abstractNum w:abstractNumId="18" w15:restartNumberingAfterBreak="0">
+    <w:nsid w:val="365516F6"/>
+    <w:multiLevelType w:val="hybridMultilevel"/>
+    <w:tmpl w:val="47282AF2"/>
+    <w:lvl w:ilvl="0" w:tplc="04090001">
+      <w:start w:val="1"/>
+      <w:numFmt w:val="bullet"/>
+      <w:lvlText w:val=""/>
+      <w:lvlJc w:val="left"/>
+      <w:pPr>
+        <w:ind w:left="1440" w:hanging="360"/>
+      </w:pPr>
+      <w:rPr>
+        <w:rFonts w:ascii="Symbol" w:hAnsi="Symbol" w:hint="default"/>
+      </w:rPr>
+    </w:lvl>
+    <w:lvl w:ilvl="1" w:tplc="04090003" w:tentative="1">
+      <w:start w:val="1"/>
+      <w:numFmt w:val="bullet"/>
+      <w:lvlText w:val="o"/>
+      <w:lvlJc w:val="left"/>
+      <w:pPr>
+        <w:ind w:left="2160" w:hanging="360"/>
+      </w:pPr>
+      <w:rPr>
+        <w:rFonts w:ascii="Courier New" w:hAnsi="Courier New" w:cs="Courier New" w:hint="default"/>
+      </w:rPr>
+    </w:lvl>
+    <w:lvl w:ilvl="2" w:tplc="04090005" w:tentative="1">
+      <w:start w:val="1"/>
+      <w:numFmt w:val="bullet"/>
+      <w:lvlText w:val=""/>
+      <w:lvlJc w:val="left"/>
+      <w:pPr>
+        <w:ind w:left="2880" w:hanging="360"/>
+      </w:pPr>
+      <w:rPr>
+        <w:rFonts w:ascii="Wingdings" w:hAnsi="Wingdings" w:hint="default"/>
+      </w:rPr>
+    </w:lvl>
+    <w:lvl w:ilvl="3" w:tplc="04090001" w:tentative="1">
+      <w:start w:val="1"/>
+      <w:numFmt w:val="bullet"/>
+      <w:lvlText w:val=""/>
+      <w:lvlJc w:val="left"/>
+      <w:pPr>
+        <w:ind w:left="3600" w:hanging="360"/>
+      </w:pPr>
+      <w:rPr>
+        <w:rFonts w:ascii="Symbol" w:hAnsi="Symbol" w:hint="default"/>
+      </w:rPr>
+    </w:lvl>
+    <w:lvl w:ilvl="4" w:tplc="04090003" w:tentative="1">
+      <w:start w:val="1"/>
+      <w:numFmt w:val="bullet"/>
+      <w:lvlText w:val="o"/>
+      <w:lvlJc w:val="left"/>
+      <w:pPr>
+        <w:ind w:left="4320" w:hanging="360"/>
+      </w:pPr>
+      <w:rPr>
+        <w:rFonts w:ascii="Courier New" w:hAnsi="Courier New" w:cs="Courier New" w:hint="default"/>
+      </w:rPr>
+    </w:lvl>
+    <w:lvl w:ilvl="5" w:tplc="04090005" w:tentative="1">
+      <w:start w:val="1"/>
+      <w:numFmt w:val="bullet"/>
+      <w:lvlText w:val=""/>
+      <w:lvlJc w:val="left"/>
+      <w:pPr>
+        <w:ind w:left="5040" w:hanging="360"/>
+      </w:pPr>
+      <w:rPr>
+        <w:rFonts w:ascii="Wingdings" w:hAnsi="Wingdings" w:hint="default"/>
+      </w:rPr>
+    </w:lvl>
+    <w:lvl w:ilvl="6" w:tplc="04090001" w:tentative="1">
+      <w:start w:val="1"/>
+      <w:numFmt w:val="bullet"/>
+      <w:lvlText w:val=""/>
+      <w:lvlJc w:val="left"/>
+      <w:pPr>
+        <w:ind w:left="5760" w:hanging="360"/>
+      </w:pPr>
+      <w:rPr>
+        <w:rFonts w:ascii="Symbol" w:hAnsi="Symbol" w:hint="default"/>
+      </w:rPr>
+    </w:lvl>
+    <w:lvl w:ilvl="7" w:tplc="04090003" w:tentative="1">
+      <w:start w:val="1"/>
+      <w:numFmt w:val="bullet"/>
+      <w:lvlText w:val="o"/>
+      <w:lvlJc w:val="left"/>
+      <w:pPr>
+        <w:ind w:left="6480" w:hanging="360"/>
+      </w:pPr>
+      <w:rPr>
+        <w:rFonts w:ascii="Courier New" w:hAnsi="Courier New" w:cs="Courier New" w:hint="default"/>
+      </w:rPr>
+    </w:lvl>
+    <w:lvl w:ilvl="8" w:tplc="04090005" w:tentative="1">
+      <w:start w:val="1"/>
+      <w:numFmt w:val="bullet"/>
+      <w:lvlText w:val=""/>
+      <w:lvlJc w:val="left"/>
+      <w:pPr>
+        <w:ind w:left="7200" w:hanging="360"/>
+      </w:pPr>
+      <w:rPr>
+        <w:rFonts w:ascii="Wingdings" w:hAnsi="Wingdings" w:hint="default"/>
+      </w:rPr>
+    </w:lvl>
+  </w:abstractNum>
+  <w:abstractNum w:abstractNumId="19" w15:restartNumberingAfterBreak="0">
     <w:nsid w:val="36AB7E05"/>
     <w:multiLevelType w:val="multilevel"/>
     <w:tmpl w:val="FFB42E42"/>
@@ -31427,7 +32595,7 @@
       </w:pPr>
     </w:lvl>
   </w:abstractNum>
-  <w:abstractNum w:abstractNumId="18" w15:restartNumberingAfterBreak="0">
+  <w:abstractNum w:abstractNumId="20" w15:restartNumberingAfterBreak="0">
     <w:nsid w:val="36B04F5A"/>
     <w:multiLevelType w:val="multilevel"/>
     <w:tmpl w:val="907A15EC"/>
@@ -31569,7 +32737,7 @@
       </w:rPr>
     </w:lvl>
   </w:abstractNum>
-  <w:abstractNum w:abstractNumId="19" w15:restartNumberingAfterBreak="0">
+  <w:abstractNum w:abstractNumId="21" w15:restartNumberingAfterBreak="0">
     <w:nsid w:val="3A162A58"/>
     <w:multiLevelType w:val="multilevel"/>
     <w:tmpl w:val="907A15EC"/>
@@ -31713,7 +32881,7 @@
       </w:rPr>
     </w:lvl>
   </w:abstractNum>
-  <w:abstractNum w:abstractNumId="20" w15:restartNumberingAfterBreak="0">
+  <w:abstractNum w:abstractNumId="22" w15:restartNumberingAfterBreak="0">
     <w:nsid w:val="43A67E07"/>
     <w:multiLevelType w:val="hybridMultilevel"/>
     <w:tmpl w:val="6194FDD6"/>
@@ -31799,7 +32967,7 @@
       </w:pPr>
     </w:lvl>
   </w:abstractNum>
-  <w:abstractNum w:abstractNumId="21" w15:restartNumberingAfterBreak="0">
+  <w:abstractNum w:abstractNumId="23" w15:restartNumberingAfterBreak="0">
     <w:nsid w:val="43AD1628"/>
     <w:multiLevelType w:val="multilevel"/>
     <w:tmpl w:val="907A15EC"/>
@@ -31943,7 +33111,93 @@
       </w:rPr>
     </w:lvl>
   </w:abstractNum>
-  <w:abstractNum w:abstractNumId="22" w15:restartNumberingAfterBreak="0">
+  <w:abstractNum w:abstractNumId="24" w15:restartNumberingAfterBreak="0">
+    <w:nsid w:val="473B5AE2"/>
+    <w:multiLevelType w:val="hybridMultilevel"/>
+    <w:tmpl w:val="CD642F3C"/>
+    <w:lvl w:ilvl="0" w:tplc="0409000F">
+      <w:start w:val="1"/>
+      <w:numFmt w:val="decimal"/>
+      <w:lvlText w:val="%1."/>
+      <w:lvlJc w:val="left"/>
+      <w:pPr>
+        <w:ind w:left="720" w:hanging="360"/>
+      </w:pPr>
+    </w:lvl>
+    <w:lvl w:ilvl="1" w:tplc="04090019" w:tentative="1">
+      <w:start w:val="1"/>
+      <w:numFmt w:val="lowerLetter"/>
+      <w:lvlText w:val="%2."/>
+      <w:lvlJc w:val="left"/>
+      <w:pPr>
+        <w:ind w:left="1440" w:hanging="360"/>
+      </w:pPr>
+    </w:lvl>
+    <w:lvl w:ilvl="2" w:tplc="0409001B" w:tentative="1">
+      <w:start w:val="1"/>
+      <w:numFmt w:val="lowerRoman"/>
+      <w:lvlText w:val="%3."/>
+      <w:lvlJc w:val="right"/>
+      <w:pPr>
+        <w:ind w:left="2160" w:hanging="180"/>
+      </w:pPr>
+    </w:lvl>
+    <w:lvl w:ilvl="3" w:tplc="0409000F" w:tentative="1">
+      <w:start w:val="1"/>
+      <w:numFmt w:val="decimal"/>
+      <w:lvlText w:val="%4."/>
+      <w:lvlJc w:val="left"/>
+      <w:pPr>
+        <w:ind w:left="2880" w:hanging="360"/>
+      </w:pPr>
+    </w:lvl>
+    <w:lvl w:ilvl="4" w:tplc="04090019" w:tentative="1">
+      <w:start w:val="1"/>
+      <w:numFmt w:val="lowerLetter"/>
+      <w:lvlText w:val="%5."/>
+      <w:lvlJc w:val="left"/>
+      <w:pPr>
+        <w:ind w:left="3600" w:hanging="360"/>
+      </w:pPr>
+    </w:lvl>
+    <w:lvl w:ilvl="5" w:tplc="0409001B" w:tentative="1">
+      <w:start w:val="1"/>
+      <w:numFmt w:val="lowerRoman"/>
+      <w:lvlText w:val="%6."/>
+      <w:lvlJc w:val="right"/>
+      <w:pPr>
+        <w:ind w:left="4320" w:hanging="180"/>
+      </w:pPr>
+    </w:lvl>
+    <w:lvl w:ilvl="6" w:tplc="0409000F" w:tentative="1">
+      <w:start w:val="1"/>
+      <w:numFmt w:val="decimal"/>
+      <w:lvlText w:val="%7."/>
+      <w:lvlJc w:val="left"/>
+      <w:pPr>
+        <w:ind w:left="5040" w:hanging="360"/>
+      </w:pPr>
+    </w:lvl>
+    <w:lvl w:ilvl="7" w:tplc="04090019" w:tentative="1">
+      <w:start w:val="1"/>
+      <w:numFmt w:val="lowerLetter"/>
+      <w:lvlText w:val="%8."/>
+      <w:lvlJc w:val="left"/>
+      <w:pPr>
+        <w:ind w:left="5760" w:hanging="360"/>
+      </w:pPr>
+    </w:lvl>
+    <w:lvl w:ilvl="8" w:tplc="0409001B" w:tentative="1">
+      <w:start w:val="1"/>
+      <w:numFmt w:val="lowerRoman"/>
+      <w:lvlText w:val="%9."/>
+      <w:lvlJc w:val="right"/>
+      <w:pPr>
+        <w:ind w:left="6480" w:hanging="180"/>
+      </w:pPr>
+    </w:lvl>
+  </w:abstractNum>
+  <w:abstractNum w:abstractNumId="25" w15:restartNumberingAfterBreak="0">
     <w:nsid w:val="4B385C71"/>
     <w:multiLevelType w:val="hybridMultilevel"/>
     <w:tmpl w:val="250EEE70"/>
@@ -32056,7 +33310,7 @@
       </w:rPr>
     </w:lvl>
   </w:abstractNum>
-  <w:abstractNum w:abstractNumId="23" w15:restartNumberingAfterBreak="0">
+  <w:abstractNum w:abstractNumId="26" w15:restartNumberingAfterBreak="0">
     <w:nsid w:val="53535320"/>
     <w:multiLevelType w:val="multilevel"/>
     <w:tmpl w:val="907A15EC"/>
@@ -32200,7 +33454,7 @@
       </w:rPr>
     </w:lvl>
   </w:abstractNum>
-  <w:abstractNum w:abstractNumId="24" w15:restartNumberingAfterBreak="0">
+  <w:abstractNum w:abstractNumId="27" w15:restartNumberingAfterBreak="0">
     <w:nsid w:val="57E83A64"/>
     <w:multiLevelType w:val="hybridMultilevel"/>
     <w:tmpl w:val="8F4E3B86"/>
@@ -32286,7 +33540,7 @@
       </w:pPr>
     </w:lvl>
   </w:abstractNum>
-  <w:abstractNum w:abstractNumId="25" w15:restartNumberingAfterBreak="0">
+  <w:abstractNum w:abstractNumId="28" w15:restartNumberingAfterBreak="0">
     <w:nsid w:val="5C562463"/>
     <w:multiLevelType w:val="hybridMultilevel"/>
     <w:tmpl w:val="413610A2"/>
@@ -32372,7 +33626,7 @@
       </w:pPr>
     </w:lvl>
   </w:abstractNum>
-  <w:abstractNum w:abstractNumId="26" w15:restartNumberingAfterBreak="0">
+  <w:abstractNum w:abstractNumId="29" w15:restartNumberingAfterBreak="0">
     <w:nsid w:val="64625A14"/>
     <w:multiLevelType w:val="hybridMultilevel"/>
     <w:tmpl w:val="F9CE0576"/>
@@ -32458,7 +33712,7 @@
       </w:pPr>
     </w:lvl>
   </w:abstractNum>
-  <w:abstractNum w:abstractNumId="27" w15:restartNumberingAfterBreak="0">
+  <w:abstractNum w:abstractNumId="30" w15:restartNumberingAfterBreak="0">
     <w:nsid w:val="65EB3CB5"/>
     <w:multiLevelType w:val="hybridMultilevel"/>
     <w:tmpl w:val="48CAEB3A"/>
@@ -32544,7 +33798,7 @@
       </w:pPr>
     </w:lvl>
   </w:abstractNum>
-  <w:abstractNum w:abstractNumId="28" w15:restartNumberingAfterBreak="0">
+  <w:abstractNum w:abstractNumId="31" w15:restartNumberingAfterBreak="0">
     <w:nsid w:val="6AFC1994"/>
     <w:multiLevelType w:val="multilevel"/>
     <w:tmpl w:val="907A15EC"/>
@@ -32687,7 +33941,7 @@
       </w:rPr>
     </w:lvl>
   </w:abstractNum>
-  <w:abstractNum w:abstractNumId="29" w15:restartNumberingAfterBreak="0">
+  <w:abstractNum w:abstractNumId="32" w15:restartNumberingAfterBreak="0">
     <w:nsid w:val="6D290926"/>
     <w:multiLevelType w:val="hybridMultilevel"/>
     <w:tmpl w:val="59C4363A"/>
@@ -32773,7 +34027,7 @@
       </w:pPr>
     </w:lvl>
   </w:abstractNum>
-  <w:abstractNum w:abstractNumId="30" w15:restartNumberingAfterBreak="0">
+  <w:abstractNum w:abstractNumId="33" w15:restartNumberingAfterBreak="0">
     <w:nsid w:val="78837D6D"/>
     <w:multiLevelType w:val="hybridMultilevel"/>
     <w:tmpl w:val="42447646"/>
@@ -32859,7 +34113,93 @@
       </w:pPr>
     </w:lvl>
   </w:abstractNum>
-  <w:abstractNum w:abstractNumId="31" w15:restartNumberingAfterBreak="0">
+  <w:abstractNum w:abstractNumId="34" w15:restartNumberingAfterBreak="0">
+    <w:nsid w:val="79BF580E"/>
+    <w:multiLevelType w:val="hybridMultilevel"/>
+    <w:tmpl w:val="A79CA5CA"/>
+    <w:lvl w:ilvl="0" w:tplc="0409000F">
+      <w:start w:val="1"/>
+      <w:numFmt w:val="decimal"/>
+      <w:lvlText w:val="%1."/>
+      <w:lvlJc w:val="left"/>
+      <w:pPr>
+        <w:ind w:left="720" w:hanging="360"/>
+      </w:pPr>
+    </w:lvl>
+    <w:lvl w:ilvl="1" w:tplc="04090019">
+      <w:start w:val="1"/>
+      <w:numFmt w:val="lowerLetter"/>
+      <w:lvlText w:val="%2."/>
+      <w:lvlJc w:val="left"/>
+      <w:pPr>
+        <w:ind w:left="1440" w:hanging="360"/>
+      </w:pPr>
+    </w:lvl>
+    <w:lvl w:ilvl="2" w:tplc="0409001B" w:tentative="1">
+      <w:start w:val="1"/>
+      <w:numFmt w:val="lowerRoman"/>
+      <w:lvlText w:val="%3."/>
+      <w:lvlJc w:val="right"/>
+      <w:pPr>
+        <w:ind w:left="2160" w:hanging="180"/>
+      </w:pPr>
+    </w:lvl>
+    <w:lvl w:ilvl="3" w:tplc="0409000F" w:tentative="1">
+      <w:start w:val="1"/>
+      <w:numFmt w:val="decimal"/>
+      <w:lvlText w:val="%4."/>
+      <w:lvlJc w:val="left"/>
+      <w:pPr>
+        <w:ind w:left="2880" w:hanging="360"/>
+      </w:pPr>
+    </w:lvl>
+    <w:lvl w:ilvl="4" w:tplc="04090019" w:tentative="1">
+      <w:start w:val="1"/>
+      <w:numFmt w:val="lowerLetter"/>
+      <w:lvlText w:val="%5."/>
+      <w:lvlJc w:val="left"/>
+      <w:pPr>
+        <w:ind w:left="3600" w:hanging="360"/>
+      </w:pPr>
+    </w:lvl>
+    <w:lvl w:ilvl="5" w:tplc="0409001B" w:tentative="1">
+      <w:start w:val="1"/>
+      <w:numFmt w:val="lowerRoman"/>
+      <w:lvlText w:val="%6."/>
+      <w:lvlJc w:val="right"/>
+      <w:pPr>
+        <w:ind w:left="4320" w:hanging="180"/>
+      </w:pPr>
+    </w:lvl>
+    <w:lvl w:ilvl="6" w:tplc="0409000F" w:tentative="1">
+      <w:start w:val="1"/>
+      <w:numFmt w:val="decimal"/>
+      <w:lvlText w:val="%7."/>
+      <w:lvlJc w:val="left"/>
+      <w:pPr>
+        <w:ind w:left="5040" w:hanging="360"/>
+      </w:pPr>
+    </w:lvl>
+    <w:lvl w:ilvl="7" w:tplc="04090019" w:tentative="1">
+      <w:start w:val="1"/>
+      <w:numFmt w:val="lowerLetter"/>
+      <w:lvlText w:val="%8."/>
+      <w:lvlJc w:val="left"/>
+      <w:pPr>
+        <w:ind w:left="5760" w:hanging="360"/>
+      </w:pPr>
+    </w:lvl>
+    <w:lvl w:ilvl="8" w:tplc="0409001B" w:tentative="1">
+      <w:start w:val="1"/>
+      <w:numFmt w:val="lowerRoman"/>
+      <w:lvlText w:val="%9."/>
+      <w:lvlJc w:val="right"/>
+      <w:pPr>
+        <w:ind w:left="6480" w:hanging="180"/>
+      </w:pPr>
+    </w:lvl>
+  </w:abstractNum>
+  <w:abstractNum w:abstractNumId="35" w15:restartNumberingAfterBreak="0">
     <w:nsid w:val="7AFB4195"/>
     <w:multiLevelType w:val="multilevel"/>
     <w:tmpl w:val="FA0685B6"/>
@@ -32954,7 +34294,7 @@
       </w:pPr>
     </w:lvl>
   </w:abstractNum>
-  <w:abstractNum w:abstractNumId="32" w15:restartNumberingAfterBreak="0">
+  <w:abstractNum w:abstractNumId="36" w15:restartNumberingAfterBreak="0">
     <w:nsid w:val="7CE6451A"/>
     <w:multiLevelType w:val="multilevel"/>
     <w:tmpl w:val="907A15EC"/>
@@ -33097,7 +34437,7 @@
       </w:rPr>
     </w:lvl>
   </w:abstractNum>
-  <w:abstractNum w:abstractNumId="33" w15:restartNumberingAfterBreak="0">
+  <w:abstractNum w:abstractNumId="37" w15:restartNumberingAfterBreak="0">
     <w:nsid w:val="7EC5257E"/>
     <w:multiLevelType w:val="multilevel"/>
     <w:tmpl w:val="E2126A10"/>
@@ -33217,34 +34557,34 @@
     <w:abstractNumId w:val="10"/>
   </w:num>
   <w:num w:numId="3" w16cid:durableId="1826817505">
-    <w:abstractNumId w:val="19"/>
+    <w:abstractNumId w:val="21"/>
   </w:num>
   <w:num w:numId="4" w16cid:durableId="521818124">
-    <w:abstractNumId w:val="21"/>
+    <w:abstractNumId w:val="23"/>
   </w:num>
   <w:num w:numId="5" w16cid:durableId="713194525">
-    <w:abstractNumId w:val="23"/>
+    <w:abstractNumId w:val="26"/>
   </w:num>
   <w:num w:numId="6" w16cid:durableId="461656557">
-    <w:abstractNumId w:val="16"/>
+    <w:abstractNumId w:val="17"/>
   </w:num>
   <w:num w:numId="7" w16cid:durableId="8991721">
     <w:abstractNumId w:val="8"/>
   </w:num>
   <w:num w:numId="8" w16cid:durableId="1709380337">
-    <w:abstractNumId w:val="17"/>
+    <w:abstractNumId w:val="19"/>
   </w:num>
   <w:num w:numId="9" w16cid:durableId="920262004">
-    <w:abstractNumId w:val="32"/>
+    <w:abstractNumId w:val="36"/>
   </w:num>
   <w:num w:numId="10" w16cid:durableId="643239286">
-    <w:abstractNumId w:val="18"/>
+    <w:abstractNumId w:val="20"/>
   </w:num>
   <w:num w:numId="11" w16cid:durableId="42411586">
-    <w:abstractNumId w:val="28"/>
+    <w:abstractNumId w:val="31"/>
   </w:num>
   <w:num w:numId="12" w16cid:durableId="1891064689">
-    <w:abstractNumId w:val="22"/>
+    <w:abstractNumId w:val="25"/>
   </w:num>
   <w:num w:numId="13" w16cid:durableId="2119256425">
     <w:abstractNumId w:val="2"/>
@@ -33253,19 +34593,19 @@
     <w:abstractNumId w:val="1"/>
   </w:num>
   <w:num w:numId="15" w16cid:durableId="508719559">
-    <w:abstractNumId w:val="15"/>
+    <w:abstractNumId w:val="16"/>
   </w:num>
   <w:num w:numId="16" w16cid:durableId="1156610840">
     <w:abstractNumId w:val="3"/>
   </w:num>
   <w:num w:numId="17" w16cid:durableId="2105420301">
-    <w:abstractNumId w:val="33"/>
+    <w:abstractNumId w:val="37"/>
   </w:num>
   <w:num w:numId="18" w16cid:durableId="1116632588">
-    <w:abstractNumId w:val="31"/>
+    <w:abstractNumId w:val="35"/>
   </w:num>
   <w:num w:numId="19" w16cid:durableId="555288108">
-    <w:abstractNumId w:val="29"/>
+    <w:abstractNumId w:val="32"/>
   </w:num>
   <w:num w:numId="20" w16cid:durableId="442916540">
     <w:abstractNumId w:val="12"/>
@@ -33274,10 +34614,10 @@
     <w:abstractNumId w:val="4"/>
   </w:num>
   <w:num w:numId="22" w16cid:durableId="1969972926">
-    <w:abstractNumId w:val="24"/>
+    <w:abstractNumId w:val="27"/>
   </w:num>
   <w:num w:numId="23" w16cid:durableId="908425387">
-    <w:abstractNumId w:val="30"/>
+    <w:abstractNumId w:val="33"/>
   </w:num>
   <w:num w:numId="24" w16cid:durableId="1304503192">
     <w:abstractNumId w:val="11"/>
@@ -33295,22 +34635,34 @@
     <w:abstractNumId w:val="7"/>
   </w:num>
   <w:num w:numId="29" w16cid:durableId="1626620743">
-    <w:abstractNumId w:val="20"/>
+    <w:abstractNumId w:val="22"/>
   </w:num>
   <w:num w:numId="30" w16cid:durableId="562369332">
-    <w:abstractNumId w:val="27"/>
+    <w:abstractNumId w:val="30"/>
   </w:num>
   <w:num w:numId="31" w16cid:durableId="2095274946">
-    <w:abstractNumId w:val="25"/>
+    <w:abstractNumId w:val="28"/>
   </w:num>
   <w:num w:numId="32" w16cid:durableId="1132794262">
-    <w:abstractNumId w:val="26"/>
+    <w:abstractNumId w:val="29"/>
   </w:num>
   <w:num w:numId="33" w16cid:durableId="1514610019">
     <w:abstractNumId w:val="6"/>
   </w:num>
   <w:num w:numId="34" w16cid:durableId="224338476">
+    <w:abstractNumId w:val="15"/>
+  </w:num>
+  <w:num w:numId="35" w16cid:durableId="1661037936">
+    <w:abstractNumId w:val="18"/>
+  </w:num>
+  <w:num w:numId="36" w16cid:durableId="1514955942">
+    <w:abstractNumId w:val="34"/>
+  </w:num>
+  <w:num w:numId="37" w16cid:durableId="1281063775">
     <w:abstractNumId w:val="14"/>
+  </w:num>
+  <w:num w:numId="38" w16cid:durableId="2045907153">
+    <w:abstractNumId w:val="24"/>
   </w:num>
   <w:numIdMacAtCleanup w:val="24"/>
 </w:numbering>
@@ -34121,7 +35473,7 @@
     <w:next w:val="Normal"/>
     <w:autoRedefine/>
     <w:qFormat/>
-    <w:rsid w:val="002841F9"/>
+    <w:rsid w:val="00B7159D"/>
     <w:pPr>
       <w:spacing w:before="120" w:after="240"/>
       <w:ind w:firstLine="0"/>

</xml_diff>